<commit_message>
docs(web): agregar Facebook oficial y QR
</commit_message>
<xml_diff>
--- a/docs/SW2/build/WirelessHeatMapper-SW2-Consolidado.docx
+++ b/docs/SW2/build/WirelessHeatMapper-SW2-Consolidado.docx
@@ -11816,7 +11816,7 @@
     </w:tbl>
     <w:bookmarkEnd w:id="113"/>
     <w:bookmarkEnd w:id="114"/>
-    <w:bookmarkStart w:id="144" w:name="sitio-web-de-la-empresa"/>
+    <w:bookmarkStart w:id="145" w:name="sitio-web-de-la-empresa"/>
     <w:p>
       <w:pPr>
         <w:pStyle w:val="Heading1"/>
@@ -11867,7 +11867,7 @@
       </w:r>
     </w:p>
     <w:bookmarkEnd w:id="115"/>
-    <w:bookmarkStart w:id="117" w:name="url-publica"/>
+    <w:bookmarkStart w:id="118" w:name="url-publica"/>
     <w:p>
       <w:pPr>
         <w:pStyle w:val="Heading2"/>
@@ -11917,8 +11917,37 @@
         <w:t xml:space="preserve">, tuneles temporales ni servidores personales apagables durante la evaluacion.</w:t>
       </w:r>
     </w:p>
-    <w:bookmarkEnd w:id="117"/>
-    <w:bookmarkStart w:id="118" w:name="objetivos-del-sitio"/>
+    <w:p>
+      <w:pPr>
+        <w:pStyle w:val="BodyText"/>
+      </w:pPr>
+      <w:r>
+        <w:t xml:space="preserve">La pagina oficial de la empresa en Facebook se encuentra en:</w:t>
+      </w:r>
+    </w:p>
+    <w:p>
+      <w:pPr>
+        <w:pStyle w:val="BodyText"/>
+      </w:pPr>
+      <w:hyperlink r:id="rId117">
+        <w:r>
+          <w:rPr>
+            <w:rStyle w:val="Hyperlink"/>
+          </w:rPr>
+          <w:t xml:space="preserve">https://www.facebook.com/profile.php?id=61591962512748</w:t>
+        </w:r>
+      </w:hyperlink>
+    </w:p>
+    <w:p>
+      <w:pPr>
+        <w:pStyle w:val="BodyText"/>
+      </w:pPr>
+      <w:r>
+        <w:t xml:space="preserve">Este enlace se incorpora como canal publico de difusion y debe acompanarse con codigo QR en anexos o material promocional. No se publican enlaces a otras redes sociales porque no forman parte de los canales oficiales vigentes.</w:t>
+      </w:r>
+    </w:p>
+    <w:bookmarkEnd w:id="118"/>
+    <w:bookmarkStart w:id="119" w:name="objetivos-del-sitio"/>
     <w:p>
       <w:pPr>
         <w:pStyle w:val="Heading2"/>
@@ -12110,8 +12139,8 @@
         </w:tc>
       </w:tr>
     </w:tbl>
-    <w:bookmarkEnd w:id="118"/>
-    <w:bookmarkStart w:id="119" w:name="publico-objetivo"/>
+    <w:bookmarkEnd w:id="119"/>
+    <w:bookmarkStart w:id="120" w:name="publico-objetivo"/>
     <w:p>
       <w:pPr>
         <w:pStyle w:val="Heading2"/>
@@ -12279,8 +12308,8 @@
         </w:tc>
       </w:tr>
     </w:tbl>
-    <w:bookmarkEnd w:id="119"/>
-    <w:bookmarkStart w:id="120" w:name="mapa-de-secciones-publicas"/>
+    <w:bookmarkEnd w:id="120"/>
+    <w:bookmarkStart w:id="121" w:name="mapa-de-secciones-publicas"/>
     <w:p>
       <w:pPr>
         <w:pStyle w:val="Heading2"/>
@@ -12655,8 +12684,8 @@
         </w:tc>
       </w:tr>
     </w:tbl>
-    <w:bookmarkEnd w:id="120"/>
-    <w:bookmarkStart w:id="121" w:name="seccion-empresa"/>
+    <w:bookmarkEnd w:id="121"/>
+    <w:bookmarkStart w:id="122" w:name="seccion-empresa"/>
     <w:p>
       <w:pPr>
         <w:pStyle w:val="Heading2"/>
@@ -12794,8 +12823,8 @@
         <w:t xml:space="preserve">Perfil del equipo: desarrollo web, movil, backend, documentacion, pruebas y despliegue.</w:t>
       </w:r>
     </w:p>
-    <w:bookmarkEnd w:id="121"/>
-    <w:bookmarkStart w:id="122" w:name="seccion-servicios"/>
+    <w:bookmarkEnd w:id="122"/>
+    <w:bookmarkStart w:id="123" w:name="seccion-servicios"/>
     <w:p>
       <w:pPr>
         <w:pStyle w:val="Heading2"/>
@@ -13027,8 +13056,8 @@
         <w:t xml:space="preserve">Cada servicio debe incluir una descripcion breve, beneficios, ejemplos de entregables y un llamado a contacto.</w:t>
       </w:r>
     </w:p>
-    <w:bookmarkEnd w:id="122"/>
-    <w:bookmarkStart w:id="123" w:name="seccion-producto-wireless-heatmapper"/>
+    <w:bookmarkEnd w:id="123"/>
+    <w:bookmarkStart w:id="124" w:name="seccion-producto-wireless-heatmapper"/>
     <w:p>
       <w:pPr>
         <w:pStyle w:val="Heading2"/>
@@ -13133,8 +13162,8 @@
         <w:t xml:space="preserve">La seccion debe incluir enlaces hacia login, portal, manual de usuario, API/documentacion tecnica cuando corresponda y canal de soporte.</w:t>
       </w:r>
     </w:p>
-    <w:bookmarkEnd w:id="123"/>
-    <w:bookmarkStart w:id="124" w:name="seccion-descargas"/>
+    <w:bookmarkEnd w:id="124"/>
+    <w:bookmarkStart w:id="125" w:name="seccion-descargas"/>
     <w:p>
       <w:pPr>
         <w:pStyle w:val="Heading2"/>
@@ -13385,8 +13414,8 @@
         <w:t xml:space="preserve">Los enlaces rotos, archivos duplicados o versiones obsoletas deben retirarse o marcarse claramente como historicas.</w:t>
       </w:r>
     </w:p>
-    <w:bookmarkEnd w:id="124"/>
-    <w:bookmarkStart w:id="127" w:name="seccion-soporte"/>
+    <w:bookmarkEnd w:id="125"/>
+    <w:bookmarkStart w:id="128" w:name="seccion-soporte"/>
     <w:p>
       <w:pPr>
         <w:pStyle w:val="Heading2"/>
@@ -13475,7 +13504,7 @@
         <w:t xml:space="preserve">Flujo de escalamiento desde chatbot hacia soporte humano.</w:t>
       </w:r>
     </w:p>
-    <w:bookmarkStart w:id="125" w:name="clasificacion-de-incidentes"/>
+    <w:bookmarkStart w:id="126" w:name="clasificacion-de-incidentes"/>
     <w:p>
       <w:pPr>
         <w:pStyle w:val="Heading3"/>
@@ -13640,8 +13669,8 @@
         </w:tc>
       </w:tr>
     </w:tbl>
-    <w:bookmarkEnd w:id="125"/>
-    <w:bookmarkStart w:id="126" w:name="datos-requeridos-para-soporte"/>
+    <w:bookmarkEnd w:id="126"/>
+    <w:bookmarkStart w:id="127" w:name="datos-requeridos-para-soporte"/>
     <w:p>
       <w:pPr>
         <w:pStyle w:val="Heading3"/>
@@ -13734,9 +13763,9 @@
         <w:t xml:space="preserve">Version de APK o navegador utilizado.</w:t>
       </w:r>
     </w:p>
-    <w:bookmarkEnd w:id="126"/>
     <w:bookmarkEnd w:id="127"/>
-    <w:bookmarkStart w:id="128" w:name="seccion-contacto"/>
+    <w:bookmarkEnd w:id="128"/>
+    <w:bookmarkStart w:id="129" w:name="seccion-contacto"/>
     <w:p>
       <w:pPr>
         <w:pStyle w:val="Heading2"/>
@@ -13871,18 +13900,32 @@
               <w:pStyle w:val="Compact"/>
             </w:pPr>
             <w:r>
-              <w:t xml:space="preserve">Redes sociales</w:t>
-            </w:r>
-          </w:p>
-        </w:tc>
-        <w:tc>
-          <w:tcPr/>
-          <w:p>
-            <w:pPr>
-              <w:pStyle w:val="Compact"/>
-            </w:pPr>
-            <w:r>
-              <w:t xml:space="preserve">Difusion institucional, marketing y anuncios publicos.</w:t>
+              <w:t xml:space="preserve">Facebook oficial</w:t>
+            </w:r>
+          </w:p>
+        </w:tc>
+        <w:tc>
+          <w:tcPr/>
+          <w:p>
+            <w:pPr>
+              <w:pStyle w:val="Compact"/>
+            </w:pPr>
+            <w:r>
+              <w:t xml:space="preserve">Difusion institucional, marketing y anuncios publicos mediante la pagina</w:t>
+            </w:r>
+            <w:r>
+              <w:t xml:space="preserve"> </w:t>
+            </w:r>
+            <w:hyperlink r:id="rId117">
+              <w:r>
+                <w:rPr>
+                  <w:rStyle w:val="Hyperlink"/>
+                </w:rPr>
+                <w:t xml:space="preserve">https://www.facebook.com/profile.php?id=61591962512748</w:t>
+              </w:r>
+            </w:hyperlink>
+            <w:r>
+              <w:t xml:space="preserve">.</w:t>
             </w:r>
           </w:p>
         </w:tc>
@@ -13920,8 +13963,8 @@
         <w:t xml:space="preserve">El formulario debe pedir solo datos necesarios: nombre, correo, organizacion, motivo, mensaje y consentimiento para tratamiento de datos. No debe solicitar contrasenas, tokens, credenciales ni informacion sensible de redes internas.</w:t>
       </w:r>
     </w:p>
-    <w:bookmarkEnd w:id="128"/>
-    <w:bookmarkStart w:id="134" w:name="chatbot-entrenado"/>
+    <w:bookmarkEnd w:id="129"/>
+    <w:bookmarkStart w:id="135" w:name="chatbot-entrenado"/>
     <w:p>
       <w:pPr>
         <w:pStyle w:val="Heading2"/>
@@ -13938,7 +13981,7 @@
         <w:t xml:space="preserve">El sitio debe incluir un chatbot propio o integrado que responda con informacion especifica de Team 24 Software y Wireless HeatMapper. No debe limitarse a redirigir a WhatsApp ni responder con texto generico sin contexto.</w:t>
       </w:r>
     </w:p>
-    <w:bookmarkStart w:id="129" w:name="objetivo-del-chatbot"/>
+    <w:bookmarkStart w:id="130" w:name="objetivo-del-chatbot"/>
     <w:p>
       <w:pPr>
         <w:pStyle w:val="Heading3"/>
@@ -13955,8 +13998,8 @@
         <w:t xml:space="preserve">Atender consultas frecuentes, reducir carga de soporte inicial y guiar al visitante hacia la seccion correcta del sitio. Cuando la consulta supere su alcance, debe escalar al formulario de contacto o al canal de soporte humano.</w:t>
       </w:r>
     </w:p>
-    <w:bookmarkEnd w:id="129"/>
-    <w:bookmarkStart w:id="130" w:name="base-de-conocimiento"/>
+    <w:bookmarkEnd w:id="130"/>
+    <w:bookmarkStart w:id="131" w:name="base-de-conocimiento"/>
     <w:p>
       <w:pPr>
         <w:pStyle w:val="Heading3"/>
@@ -14172,8 +14215,8 @@
         </w:tc>
       </w:tr>
     </w:tbl>
-    <w:bookmarkEnd w:id="130"/>
-    <w:bookmarkStart w:id="131" w:name="preguntas-que-debe-responder"/>
+    <w:bookmarkEnd w:id="131"/>
+    <w:bookmarkStart w:id="132" w:name="preguntas-que-debe-responder"/>
     <w:p>
       <w:pPr>
         <w:pStyle w:val="Heading3"/>
@@ -14302,8 +14345,8 @@
         <w:t xml:space="preserve">Que datos trata el sistema?</w:t>
       </w:r>
     </w:p>
-    <w:bookmarkEnd w:id="131"/>
-    <w:bookmarkStart w:id="132" w:name="limites-y-seguridad-del-chatbot"/>
+    <w:bookmarkEnd w:id="132"/>
+    <w:bookmarkStart w:id="133" w:name="limites-y-seguridad-del-chatbot"/>
     <w:p>
       <w:pPr>
         <w:pStyle w:val="Heading3"/>
@@ -14404,8 +14447,8 @@
         <w:t xml:space="preserve">Basar respuestas en documentacion aprobada, no en suposiciones.</w:t>
       </w:r>
     </w:p>
-    <w:bookmarkEnd w:id="132"/>
-    <w:bookmarkStart w:id="133" w:name="mantenimiento-del-entrenamiento"/>
+    <w:bookmarkEnd w:id="133"/>
+    <w:bookmarkStart w:id="134" w:name="mantenimiento-del-entrenamiento"/>
     <w:p>
       <w:pPr>
         <w:pStyle w:val="Heading3"/>
@@ -14538,9 +14581,9 @@
         <w:t xml:space="preserve">Cada actualizacion debe registrar fecha, responsable, fuente documental usada y alcance del cambio.</w:t>
       </w:r>
     </w:p>
-    <w:bookmarkEnd w:id="133"/>
     <w:bookmarkEnd w:id="134"/>
-    <w:bookmarkStart w:id="135" w:name="politicas-publicas-del-sitio"/>
+    <w:bookmarkEnd w:id="135"/>
+    <w:bookmarkStart w:id="136" w:name="politicas-publicas-del-sitio"/>
     <w:p>
       <w:pPr>
         <w:pStyle w:val="Heading2"/>
@@ -14748,8 +14791,8 @@
         <w:t xml:space="preserve">Estas politicas deben estar visibles desde el pie de pagina y desde la seccion de soporte o contacto.</w:t>
       </w:r>
     </w:p>
-    <w:bookmarkEnd w:id="135"/>
-    <w:bookmarkStart w:id="140" w:name="politicas-de-mantenimiento-del-contenido"/>
+    <w:bookmarkEnd w:id="136"/>
+    <w:bookmarkStart w:id="141" w:name="politicas-de-mantenimiento-del-contenido"/>
     <w:p>
       <w:pPr>
         <w:pStyle w:val="Heading2"/>
@@ -14766,7 +14809,7 @@
         <w:t xml:space="preserve">El contenido del sitio debe tratarse como informacion oficial de la empresa. Cualquier cambio debe ser revisado antes de publicarse, especialmente si afecta producto, soporte, politicas o descargas.</w:t>
       </w:r>
     </w:p>
-    <w:bookmarkStart w:id="136" w:name="responsabilidades"/>
+    <w:bookmarkStart w:id="137" w:name="responsabilidades"/>
     <w:p>
       <w:pPr>
         <w:pStyle w:val="Heading3"/>
@@ -14910,8 +14953,8 @@
         </w:tc>
       </w:tr>
     </w:tbl>
-    <w:bookmarkEnd w:id="136"/>
-    <w:bookmarkStart w:id="137" w:name="frecuencia-de-revision"/>
+    <w:bookmarkEnd w:id="137"/>
+    <w:bookmarkStart w:id="138" w:name="frecuencia-de-revision"/>
     <w:p>
       <w:pPr>
         <w:pStyle w:val="Heading3"/>
@@ -15079,8 +15122,8 @@
         </w:tc>
       </w:tr>
     </w:tbl>
-    <w:bookmarkEnd w:id="137"/>
-    <w:bookmarkStart w:id="138" w:name="flujo-de-cambio-de-contenido"/>
+    <w:bookmarkEnd w:id="138"/>
+    <w:bookmarkStart w:id="139" w:name="flujo-de-cambio-de-contenido"/>
     <w:p>
       <w:pPr>
         <w:pStyle w:val="Heading3"/>
@@ -15161,8 +15204,8 @@
         <w:t xml:space="preserve">Registrar fecha, responsable y descripcion breve del cambio.</w:t>
       </w:r>
     </w:p>
-    <w:bookmarkEnd w:id="138"/>
-    <w:bookmarkStart w:id="139" w:name="criterios-de-retiro-de-contenido"/>
+    <w:bookmarkEnd w:id="139"/>
+    <w:bookmarkStart w:id="140" w:name="criterios-de-retiro-de-contenido"/>
     <w:p>
       <w:pPr>
         <w:pStyle w:val="Heading3"/>
@@ -15275,9 +15318,9 @@
         <w:t xml:space="preserve">confunda a Team 24 Software con Bulldog Tech.</w:t>
       </w:r>
     </w:p>
-    <w:bookmarkEnd w:id="139"/>
     <w:bookmarkEnd w:id="140"/>
-    <w:bookmarkStart w:id="141" w:name="X2d9395c5b0433e52371ec0a295ad3535a4497af"/>
+    <w:bookmarkEnd w:id="141"/>
+    <w:bookmarkStart w:id="142" w:name="X2d9395c5b0433e52371ec0a295ad3535a4497af"/>
     <w:p>
       <w:pPr>
         <w:pStyle w:val="Heading2"/>
@@ -15517,8 +15560,8 @@
         </w:tc>
       </w:tr>
     </w:tbl>
-    <w:bookmarkEnd w:id="141"/>
-    <w:bookmarkStart w:id="142" w:name="evidencias-recomendadas"/>
+    <w:bookmarkEnd w:id="142"/>
+    <w:bookmarkStart w:id="143" w:name="evidencias-recomendadas"/>
     <w:p>
       <w:pPr>
         <w:pStyle w:val="Heading2"/>
@@ -15631,8 +15674,8 @@
         <w:t xml:space="preserve">commit o version donde se actualizo el contenido.</w:t>
       </w:r>
     </w:p>
-    <w:bookmarkEnd w:id="142"/>
-    <w:bookmarkStart w:id="143" w:name="relacion-con-otros-documentos"/>
+    <w:bookmarkEnd w:id="143"/>
+    <w:bookmarkStart w:id="144" w:name="relacion-con-otros-documentos"/>
     <w:p>
       <w:pPr>
         <w:pStyle w:val="Heading2"/>
@@ -15775,9 +15818,9 @@
         <w:t xml:space="preserve">, para ficha tecnica de Wireless HeatMapper.</w:t>
       </w:r>
     </w:p>
-    <w:bookmarkEnd w:id="143"/>
     <w:bookmarkEnd w:id="144"/>
-    <w:bookmarkStart w:id="155" w:name="estudio-de-mercado"/>
+    <w:bookmarkEnd w:id="145"/>
+    <w:bookmarkStart w:id="156" w:name="estudio-de-mercado"/>
     <w:p>
       <w:pPr>
         <w:pStyle w:val="Heading1"/>
@@ -15786,7 +15829,7 @@
         <w:t xml:space="preserve">Estudio de mercado</w:t>
       </w:r>
     </w:p>
-    <w:bookmarkStart w:id="145" w:name="objetivo"/>
+    <w:bookmarkStart w:id="146" w:name="objetivo"/>
     <w:p>
       <w:pPr>
         <w:pStyle w:val="Heading2"/>
@@ -15803,8 +15846,8 @@
         <w:t xml:space="preserve">Evaluar la oportunidad comercial de Wireless HeatMapper para empresas que instalan, diagnostican o mantienen redes WiFi en interiores, con enfasis inicial en Bolivia y posibilidad de expansion regional.</w:t>
       </w:r>
     </w:p>
-    <w:bookmarkEnd w:id="145"/>
-    <w:bookmarkStart w:id="146" w:name="mercado-objetivo"/>
+    <w:bookmarkEnd w:id="146"/>
+    <w:bookmarkStart w:id="147" w:name="mercado-objetivo"/>
     <w:p>
       <w:pPr>
         <w:pStyle w:val="Heading2"/>
@@ -15881,8 +15924,8 @@
         <w:t xml:space="preserve">Empresas con multiples sedes que requieren estandarizar auditorias WiFi.</w:t>
       </w:r>
     </w:p>
-    <w:bookmarkEnd w:id="146"/>
-    <w:bookmarkStart w:id="147" w:name="segmentacion"/>
+    <w:bookmarkEnd w:id="147"/>
+    <w:bookmarkStart w:id="148" w:name="segmentacion"/>
     <w:p>
       <w:pPr>
         <w:pStyle w:val="Heading2"/>
@@ -16117,8 +16160,8 @@
         </w:tc>
       </w:tr>
     </w:tbl>
-    <w:bookmarkEnd w:id="147"/>
-    <w:bookmarkStart w:id="148" w:name="competencia-y-sustitutos"/>
+    <w:bookmarkEnd w:id="148"/>
+    <w:bookmarkStart w:id="149" w:name="competencia-y-sustitutos"/>
     <w:p>
       <w:pPr>
         <w:pStyle w:val="Heading2"/>
@@ -16326,8 +16369,8 @@
         <w:t xml:space="preserve">Como referencia de problema economico, herramientas comerciales de site survey pueden superar USD 3.000 anuales por licencia, lo que crea espacio para una solucion SaaS local o regional de menor costo.</w:t>
       </w:r>
     </w:p>
-    <w:bookmarkEnd w:id="148"/>
-    <w:bookmarkStart w:id="149" w:name="supuestos-cuantitativos-iniciales"/>
+    <w:bookmarkEnd w:id="149"/>
+    <w:bookmarkStart w:id="150" w:name="supuestos-cuantitativos-iniciales"/>
     <w:p>
       <w:pPr>
         <w:pStyle w:val="Heading2"/>
@@ -16551,8 +16594,8 @@
         </w:tc>
       </w:tr>
     </w:tbl>
-    <w:bookmarkEnd w:id="149"/>
-    <w:bookmarkStart w:id="150" w:name="modelo-de-monetizacion"/>
+    <w:bookmarkEnd w:id="150"/>
+    <w:bookmarkStart w:id="151" w:name="modelo-de-monetizacion"/>
     <w:p>
       <w:pPr>
         <w:pStyle w:val="Heading2"/>
@@ -16760,8 +16803,8 @@
         </w:tc>
       </w:tr>
     </w:tbl>
-    <w:bookmarkEnd w:id="150"/>
-    <w:bookmarkStart w:id="151" w:name="proyeccion-simple-de-ingresos"/>
+    <w:bookmarkEnd w:id="151"/>
+    <w:bookmarkStart w:id="152" w:name="proyeccion-simple-de-ingresos"/>
     <w:p>
       <w:pPr>
         <w:pStyle w:val="Heading2"/>
@@ -16979,8 +17022,8 @@
         <w:t xml:space="preserve">Ingresos por capacitacion pueden agregar entre USD 450 y USD 1.800 durante el primer ano, segun cantidad de clientes y servicios contratados.</w:t>
       </w:r>
     </w:p>
-    <w:bookmarkEnd w:id="151"/>
-    <w:bookmarkStart w:id="152" w:name="X0b6ab6f2cc2eeab2821dd12aad75282754922c9"/>
+    <w:bookmarkEnd w:id="152"/>
+    <w:bookmarkStart w:id="153" w:name="X0b6ab6f2cc2eeab2821dd12aad75282754922c9"/>
     <w:p>
       <w:pPr>
         <w:pStyle w:val="Heading2"/>
@@ -17148,8 +17191,8 @@
         </w:tc>
       </w:tr>
     </w:tbl>
-    <w:bookmarkEnd w:id="152"/>
-    <w:bookmarkStart w:id="153" w:name="indicadores-de-mercado"/>
+    <w:bookmarkEnd w:id="153"/>
+    <w:bookmarkStart w:id="154" w:name="indicadores-de-mercado"/>
     <w:p>
       <w:pPr>
         <w:pStyle w:val="Heading2"/>
@@ -17230,8 +17273,8 @@
         <w:t xml:space="preserve">Satisfaccion de clientes y tecnicos.</w:t>
       </w:r>
     </w:p>
-    <w:bookmarkEnd w:id="153"/>
-    <w:bookmarkStart w:id="154" w:name="conclusion-comercial"/>
+    <w:bookmarkEnd w:id="154"/>
+    <w:bookmarkStart w:id="155" w:name="conclusion-comercial"/>
     <w:p>
       <w:pPr>
         <w:pStyle w:val="Heading2"/>
@@ -17248,9 +17291,9 @@
         <w:t xml:space="preserve">Wireless HeatMapper es viable como producto SaaS especializado si se posiciona en el espacio entre apps gratuitas insuficientes y suites profesionales costosas. El mercado inicial no debe asumirse masivo; debe trabajarse por nicho, con demostraciones tecnicas, pilotos controlados y validacion de disposicion de pago.</w:t>
       </w:r>
     </w:p>
-    <w:bookmarkEnd w:id="154"/>
     <w:bookmarkEnd w:id="155"/>
-    <w:bookmarkStart w:id="171" w:name="plan-de-pruebas-del-software"/>
+    <w:bookmarkEnd w:id="156"/>
+    <w:bookmarkStart w:id="172" w:name="plan-de-pruebas-del-software"/>
     <w:p>
       <w:pPr>
         <w:pStyle w:val="Heading1"/>
@@ -17259,7 +17302,7 @@
         <w:t xml:space="preserve">Plan de pruebas del software</w:t>
       </w:r>
     </w:p>
-    <w:bookmarkStart w:id="156" w:name="proposito-2"/>
+    <w:bookmarkStart w:id="157" w:name="proposito-2"/>
     <w:p>
       <w:pPr>
         <w:pStyle w:val="Heading2"/>
@@ -17276,8 +17319,8 @@
         <w:t xml:space="preserve">El plan de pruebas asegura que Wireless HeatMapper cumpla requisitos funcionales, no funcionales y de negocio antes de su entrega como producto. Integra pruebas de desarrollador, QA y Product Owner, ademas de tecnicas de caja blanca, checklists, rendimiento y seguridad.</w:t>
       </w:r>
     </w:p>
-    <w:bookmarkEnd w:id="156"/>
-    <w:bookmarkStart w:id="157" w:name="X29799a1b016ea2d8a47ecb4ec4a3d14bd6b6a6a"/>
+    <w:bookmarkEnd w:id="157"/>
+    <w:bookmarkStart w:id="158" w:name="X29799a1b016ea2d8a47ecb4ec4a3d14bd6b6a6a"/>
     <w:p>
       <w:pPr>
         <w:pStyle w:val="Heading2"/>
@@ -17525,8 +17568,8 @@
         <w:t xml:space="preserve">El flujo se resume en una figura UML de actividad incluida en el consolidado.</w:t>
       </w:r>
     </w:p>
-    <w:bookmarkEnd w:id="157"/>
-    <w:bookmarkStart w:id="158" w:name="niveles-obligatorios"/>
+    <w:bookmarkEnd w:id="158"/>
+    <w:bookmarkStart w:id="159" w:name="niveles-obligatorios"/>
     <w:p>
       <w:pPr>
         <w:pStyle w:val="Heading2"/>
@@ -17736,8 +17779,8 @@
         </w:tc>
       </w:tr>
     </w:tbl>
-    <w:bookmarkEnd w:id="158"/>
-    <w:bookmarkStart w:id="159" w:name="herramientas"/>
+    <w:bookmarkEnd w:id="159"/>
+    <w:bookmarkStart w:id="160" w:name="herramientas"/>
     <w:p>
       <w:pPr>
         <w:pStyle w:val="Heading2"/>
@@ -17929,8 +17972,8 @@
         </w:tc>
       </w:tr>
     </w:tbl>
-    <w:bookmarkEnd w:id="159"/>
-    <w:bookmarkStart w:id="164" w:name="tecnica-de-caja-blanca-camino-basico"/>
+    <w:bookmarkEnd w:id="160"/>
+    <w:bookmarkStart w:id="165" w:name="tecnica-de-caja-blanca-camino-basico"/>
     <w:p>
       <w:pPr>
         <w:pStyle w:val="Heading2"/>
@@ -17947,7 +17990,7 @@
         <w:t xml:space="preserve">Se seleccionan metodos con complejidad ciclomatica &gt;= 3 por contener decisiones relevantes. Para cada metodo se identifican caminos independientes y pruebas minimas.</w:t>
       </w:r>
     </w:p>
-    <w:bookmarkStart w:id="160" w:name="metodo-1-autenticacion-de-usuario"/>
+    <w:bookmarkStart w:id="161" w:name="metodo-1-autenticacion-de-usuario"/>
     <w:p>
       <w:pPr>
         <w:pStyle w:val="Heading3"/>
@@ -18180,8 +18223,8 @@
         </w:tc>
       </w:tr>
     </w:tbl>
-    <w:bookmarkEnd w:id="160"/>
-    <w:bookmarkStart w:id="161" w:name="metodo-2-carga-y-validacion-de-plano"/>
+    <w:bookmarkEnd w:id="161"/>
+    <w:bookmarkStart w:id="162" w:name="metodo-2-carga-y-validacion-de-plano"/>
     <w:p>
       <w:pPr>
         <w:pStyle w:val="Heading3"/>
@@ -18449,8 +18492,8 @@
         </w:tc>
       </w:tr>
     </w:tbl>
-    <w:bookmarkEnd w:id="161"/>
-    <w:bookmarkStart w:id="162" w:name="metodo-3-registro-de-mediciones-wifi"/>
+    <w:bookmarkEnd w:id="162"/>
+    <w:bookmarkStart w:id="163" w:name="metodo-3-registro-de-mediciones-wifi"/>
     <w:p>
       <w:pPr>
         <w:pStyle w:val="Heading3"/>
@@ -18753,8 +18796,8 @@
         </w:tc>
       </w:tr>
     </w:tbl>
-    <w:bookmarkEnd w:id="162"/>
-    <w:bookmarkStart w:id="163" w:name="metodo-4-generacion-de-heatmap"/>
+    <w:bookmarkEnd w:id="163"/>
+    <w:bookmarkStart w:id="164" w:name="metodo-4-generacion-de-heatmap"/>
     <w:p>
       <w:pPr>
         <w:pStyle w:val="Heading3"/>
@@ -19022,9 +19065,9 @@
         </w:tc>
       </w:tr>
     </w:tbl>
-    <w:bookmarkEnd w:id="163"/>
     <w:bookmarkEnd w:id="164"/>
-    <w:bookmarkStart w:id="167" w:name="checklists"/>
+    <w:bookmarkEnd w:id="165"/>
+    <w:bookmarkStart w:id="168" w:name="checklists"/>
     <w:p>
       <w:pPr>
         <w:pStyle w:val="Heading2"/>
@@ -19033,7 +19076,7 @@
         <w:t xml:space="preserve">Checklists</w:t>
       </w:r>
     </w:p>
-    <w:bookmarkStart w:id="165" w:name="checklist-previo-a-release"/>
+    <w:bookmarkStart w:id="166" w:name="checklist-previo-a-release"/>
     <w:p>
       <w:pPr>
         <w:pStyle w:val="Heading3"/>
@@ -19150,8 +19193,8 @@
         <w:t xml:space="preserve">Terminos y politica de privacidad estan disponibles.</w:t>
       </w:r>
     </w:p>
-    <w:bookmarkEnd w:id="165"/>
-    <w:bookmarkStart w:id="166" w:name="checklist-de-seguridad"/>
+    <w:bookmarkEnd w:id="166"/>
+    <w:bookmarkStart w:id="167" w:name="checklist-de-seguridad"/>
     <w:p>
       <w:pPr>
         <w:pStyle w:val="Heading3"/>
@@ -19244,9 +19287,9 @@
         <w:t xml:space="preserve">API no expone trazas internas en produccion.</w:t>
       </w:r>
     </w:p>
-    <w:bookmarkEnd w:id="166"/>
     <w:bookmarkEnd w:id="167"/>
-    <w:bookmarkStart w:id="168" w:name="pruebas-de-rendimiento"/>
+    <w:bookmarkEnd w:id="168"/>
+    <w:bookmarkStart w:id="169" w:name="pruebas-de-rendimiento"/>
     <w:p>
       <w:pPr>
         <w:pStyle w:val="Heading2"/>
@@ -19480,8 +19523,8 @@
         </w:tc>
       </w:tr>
     </w:tbl>
-    <w:bookmarkEnd w:id="168"/>
-    <w:bookmarkStart w:id="169" w:name="pruebas-de-vulnerabilidades"/>
+    <w:bookmarkEnd w:id="169"/>
+    <w:bookmarkStart w:id="170" w:name="pruebas-de-vulnerabilidades"/>
     <w:p>
       <w:pPr>
         <w:pStyle w:val="Heading2"/>
@@ -19570,8 +19613,8 @@
         <w:t xml:space="preserve">Componentes vulnerables.</w:t>
       </w:r>
     </w:p>
-    <w:bookmarkEnd w:id="169"/>
-    <w:bookmarkStart w:id="170" w:name="criterios-de-cierre"/>
+    <w:bookmarkEnd w:id="170"/>
+    <w:bookmarkStart w:id="171" w:name="criterios-de-cierre"/>
     <w:p>
       <w:pPr>
         <w:pStyle w:val="Heading2"/>
@@ -19588,9 +19631,9 @@
         <w:t xml:space="preserve">El software se considera apto para entrega cuando las pruebas obligatorias pasan, no existen defectos criticos, los hallazgos medios tienen plan de mitigacion, el Product Owner acepta el alcance y la evidencia queda registrada.</w:t>
       </w:r>
     </w:p>
-    <w:bookmarkEnd w:id="170"/>
     <w:bookmarkEnd w:id="171"/>
-    <w:bookmarkStart w:id="180" w:name="plan-de-marketing"/>
+    <w:bookmarkEnd w:id="172"/>
+    <w:bookmarkStart w:id="181" w:name="plan-de-marketing"/>
     <w:p>
       <w:pPr>
         <w:pStyle w:val="Heading1"/>
@@ -19599,7 +19642,7 @@
         <w:t xml:space="preserve">Plan de marketing</w:t>
       </w:r>
     </w:p>
-    <w:bookmarkStart w:id="172" w:name="objetivo-general-1"/>
+    <w:bookmarkStart w:id="173" w:name="objetivo-general-1"/>
     <w:p>
       <w:pPr>
         <w:pStyle w:val="Heading2"/>
@@ -19616,8 +19659,8 @@
         <w:t xml:space="preserve">Dar a conocer Team 24 Software y posicionar Wireless HeatMapper como una solucion accesible, tecnica y verificable para relevamiento de cobertura WiFi en interiores.</w:t>
       </w:r>
     </w:p>
-    <w:bookmarkEnd w:id="172"/>
-    <w:bookmarkStart w:id="173" w:name="publicos-objetivo"/>
+    <w:bookmarkEnd w:id="173"/>
+    <w:bookmarkStart w:id="174" w:name="publicos-objetivo"/>
     <w:p>
       <w:pPr>
         <w:pStyle w:val="Heading2"/>
@@ -19785,8 +19828,8 @@
         </w:tc>
       </w:tr>
     </w:tbl>
-    <w:bookmarkEnd w:id="173"/>
-    <w:bookmarkStart w:id="174" w:name="posicionamiento"/>
+    <w:bookmarkEnd w:id="174"/>
+    <w:bookmarkStart w:id="175" w:name="posicionamiento"/>
     <w:p>
       <w:pPr>
         <w:pStyle w:val="Heading2"/>
@@ -19803,14 +19846,303 @@
         <w:t xml:space="preserve">Wireless HeatMapper se posiciona como una solucion SaaS local, ligera y especializada para equipos que necesitan mapas de calor WiFi, portal cliente y trazabilidad, pero no justifican el costo de herramientas empresariales de alta gama.</w:t>
       </w:r>
     </w:p>
-    <w:bookmarkEnd w:id="174"/>
-    <w:bookmarkStart w:id="175" w:name="canales"/>
+    <w:bookmarkEnd w:id="175"/>
+    <w:bookmarkStart w:id="176" w:name="canales"/>
     <w:p>
       <w:pPr>
         <w:pStyle w:val="Heading2"/>
       </w:pPr>
       <w:r>
         <w:t xml:space="preserve">Canales</w:t>
+      </w:r>
+    </w:p>
+    <w:tbl>
+      <w:tblPr>
+        <w:tblStyle w:val="Table"/>
+        <w:tblW w:type="pct" w:w="5000"/>
+        <w:tblLayout w:type="fixed"/>
+        <w:tblLook w:firstRow="1" w:lastRow="0" w:firstColumn="0" w:lastColumn="0" w:noHBand="0" w:noVBand="0" w:val="0020"/>
+      </w:tblPr>
+      <w:tblGrid>
+        <w:gridCol w:w="4950"/>
+        <w:gridCol w:w="2970"/>
+      </w:tblGrid>
+      <w:tr>
+        <w:trPr>
+          <w:tblHeader w:val="on"/>
+        </w:trPr>
+        <w:tc>
+          <w:tcPr/>
+          <w:p>
+            <w:pPr>
+              <w:pStyle w:val="Compact"/>
+            </w:pPr>
+            <w:r>
+              <w:t xml:space="preserve">Canal</w:t>
+            </w:r>
+          </w:p>
+        </w:tc>
+        <w:tc>
+          <w:tcPr/>
+          <w:p>
+            <w:pPr>
+              <w:pStyle w:val="Compact"/>
+            </w:pPr>
+            <w:r>
+              <w:t xml:space="preserve">Uso</w:t>
+            </w:r>
+          </w:p>
+        </w:tc>
+      </w:tr>
+      <w:tr>
+        <w:tc>
+          <w:tcPr/>
+          <w:p>
+            <w:pPr>
+              <w:pStyle w:val="Compact"/>
+            </w:pPr>
+            <w:r>
+              <w:t xml:space="preserve">Sitio web</w:t>
+            </w:r>
+          </w:p>
+        </w:tc>
+        <w:tc>
+          <w:tcPr/>
+          <w:p>
+            <w:pPr>
+              <w:pStyle w:val="Compact"/>
+            </w:pPr>
+            <w:r>
+              <w:t xml:space="preserve">Presentacion institucional, demo, contacto y soporte.</w:t>
+            </w:r>
+          </w:p>
+        </w:tc>
+      </w:tr>
+      <w:tr>
+        <w:tc>
+          <w:tcPr/>
+          <w:p>
+            <w:pPr>
+              <w:pStyle w:val="Compact"/>
+            </w:pPr>
+            <w:r>
+              <w:t xml:space="preserve">Facebook oficial</w:t>
+            </w:r>
+          </w:p>
+        </w:tc>
+        <w:tc>
+          <w:tcPr/>
+          <w:p>
+            <w:pPr>
+              <w:pStyle w:val="Compact"/>
+            </w:pPr>
+            <w:r>
+              <w:t xml:space="preserve">Alcance local, demostraciones visuales y anuncios publicos en</w:t>
+            </w:r>
+            <w:r>
+              <w:t xml:space="preserve"> </w:t>
+            </w:r>
+            <w:hyperlink r:id="rId117">
+              <w:r>
+                <w:rPr>
+                  <w:rStyle w:val="Hyperlink"/>
+                </w:rPr>
+                <w:t xml:space="preserve">https://www.facebook.com/profile.php?id=61591962512748</w:t>
+              </w:r>
+            </w:hyperlink>
+            <w:r>
+              <w:t xml:space="preserve">.</w:t>
+            </w:r>
+          </w:p>
+        </w:tc>
+      </w:tr>
+      <w:tr>
+        <w:tc>
+          <w:tcPr/>
+          <w:p>
+            <w:pPr>
+              <w:pStyle w:val="Compact"/>
+            </w:pPr>
+            <w:r>
+              <w:t xml:space="preserve">WhatsApp Business</w:t>
+            </w:r>
+          </w:p>
+        </w:tc>
+        <w:tc>
+          <w:tcPr/>
+          <w:p>
+            <w:pPr>
+              <w:pStyle w:val="Compact"/>
+            </w:pPr>
+            <w:r>
+              <w:t xml:space="preserve">Contacto comercial y soporte inicial.</w:t>
+            </w:r>
+          </w:p>
+        </w:tc>
+      </w:tr>
+      <w:tr>
+        <w:tc>
+          <w:tcPr/>
+          <w:p>
+            <w:pPr>
+              <w:pStyle w:val="Compact"/>
+            </w:pPr>
+            <w:r>
+              <w:t xml:space="preserve">Ferias tecnologicas</w:t>
+            </w:r>
+          </w:p>
+        </w:tc>
+        <w:tc>
+          <w:tcPr/>
+          <w:p>
+            <w:pPr>
+              <w:pStyle w:val="Compact"/>
+            </w:pPr>
+            <w:r>
+              <w:t xml:space="preserve">Demostracion presencial con mapas de calor.</w:t>
+            </w:r>
+          </w:p>
+        </w:tc>
+      </w:tr>
+      <w:tr>
+        <w:tc>
+          <w:tcPr/>
+          <w:p>
+            <w:pPr>
+              <w:pStyle w:val="Compact"/>
+            </w:pPr>
+            <w:r>
+              <w:t xml:space="preserve">Convenios academicos</w:t>
+            </w:r>
+          </w:p>
+        </w:tc>
+        <w:tc>
+          <w:tcPr/>
+          <w:p>
+            <w:pPr>
+              <w:pStyle w:val="Compact"/>
+            </w:pPr>
+            <w:r>
+              <w:t xml:space="preserve">Validacion y difusion en entornos educativos.</w:t>
+            </w:r>
+          </w:p>
+        </w:tc>
+      </w:tr>
+      <w:tr>
+        <w:tc>
+          <w:tcPr/>
+          <w:p>
+            <w:pPr>
+              <w:pStyle w:val="Compact"/>
+            </w:pPr>
+            <w:r>
+              <w:t xml:space="preserve">Repositorio GitHub</w:t>
+            </w:r>
+          </w:p>
+        </w:tc>
+        <w:tc>
+          <w:tcPr/>
+          <w:p>
+            <w:pPr>
+              <w:pStyle w:val="Compact"/>
+            </w:pPr>
+            <w:r>
+              <w:t xml:space="preserve">Transparencia tecnica y evidencia del producto.</w:t>
+            </w:r>
+          </w:p>
+        </w:tc>
+      </w:tr>
+    </w:tbl>
+    <w:bookmarkEnd w:id="176"/>
+    <w:bookmarkStart w:id="177" w:name="material-promocional"/>
+    <w:p>
+      <w:pPr>
+        <w:pStyle w:val="Heading2"/>
+      </w:pPr>
+      <w:r>
+        <w:t xml:space="preserve">Material promocional</w:t>
+      </w:r>
+    </w:p>
+    <w:p>
+      <w:pPr>
+        <w:pStyle w:val="Compact"/>
+        <w:numPr>
+          <w:ilvl w:val="0"/>
+          <w:numId w:val="1059"/>
+        </w:numPr>
+      </w:pPr>
+      <w:r>
+        <w:t xml:space="preserve">Flyer digital de problema/solucion.</w:t>
+      </w:r>
+    </w:p>
+    <w:p>
+      <w:pPr>
+        <w:pStyle w:val="Compact"/>
+        <w:numPr>
+          <w:ilvl w:val="0"/>
+          <w:numId w:val="1059"/>
+        </w:numPr>
+      </w:pPr>
+      <w:r>
+        <w:t xml:space="preserve">Video demo de 60 a 90 segundos.</w:t>
+      </w:r>
+    </w:p>
+    <w:p>
+      <w:pPr>
+        <w:pStyle w:val="Compact"/>
+        <w:numPr>
+          <w:ilvl w:val="0"/>
+          <w:numId w:val="1059"/>
+        </w:numPr>
+      </w:pPr>
+      <w:r>
+        <w:t xml:space="preserve">Caso de uso con plano, mediciones y heatmap.</w:t>
+      </w:r>
+    </w:p>
+    <w:p>
+      <w:pPr>
+        <w:pStyle w:val="Compact"/>
+        <w:numPr>
+          <w:ilvl w:val="0"/>
+          <w:numId w:val="1059"/>
+        </w:numPr>
+      </w:pPr>
+      <w:r>
+        <w:t xml:space="preserve">Presentacion comercial corta.</w:t>
+      </w:r>
+    </w:p>
+    <w:p>
+      <w:pPr>
+        <w:pStyle w:val="Compact"/>
+        <w:numPr>
+          <w:ilvl w:val="0"/>
+          <w:numId w:val="1059"/>
+        </w:numPr>
+      </w:pPr>
+      <w:r>
+        <w:t xml:space="preserve">Publicaciones comparativas: app gratuita vs. Wireless HeatMapper.</w:t>
+      </w:r>
+    </w:p>
+    <w:p>
+      <w:pPr>
+        <w:pStyle w:val="Compact"/>
+        <w:numPr>
+          <w:ilvl w:val="0"/>
+          <w:numId w:val="1059"/>
+        </w:numPr>
+      </w:pPr>
+      <w:r>
+        <w:t xml:space="preserve">QR hacia demo web, Facebook oficial, repositorio y releases moviles.</w:t>
+      </w:r>
+    </w:p>
+    <w:bookmarkEnd w:id="177"/>
+    <w:bookmarkStart w:id="178" w:name="calendario-inicial"/>
+    <w:p>
+      <w:pPr>
+        <w:pStyle w:val="Heading2"/>
+      </w:pPr>
+      <w:r>
+        <w:t xml:space="preserve">Calendario inicial</w:t>
       </w:r>
     </w:p>
     <w:tbl>
@@ -19834,281 +20166,175 @@
               <w:pStyle w:val="Compact"/>
             </w:pPr>
             <w:r>
-              <w:t xml:space="preserve">Canal</w:t>
-            </w:r>
-          </w:p>
-        </w:tc>
-        <w:tc>
-          <w:tcPr/>
-          <w:p>
-            <w:pPr>
-              <w:pStyle w:val="Compact"/>
-            </w:pPr>
-            <w:r>
-              <w:t xml:space="preserve">Uso</w:t>
-            </w:r>
-          </w:p>
-        </w:tc>
-      </w:tr>
-      <w:tr>
-        <w:tc>
-          <w:tcPr/>
-          <w:p>
-            <w:pPr>
-              <w:pStyle w:val="Compact"/>
-            </w:pPr>
-            <w:r>
-              <w:t xml:space="preserve">Sitio web</w:t>
-            </w:r>
-          </w:p>
-        </w:tc>
-        <w:tc>
-          <w:tcPr/>
-          <w:p>
-            <w:pPr>
-              <w:pStyle w:val="Compact"/>
-            </w:pPr>
-            <w:r>
-              <w:t xml:space="preserve">Presentacion institucional, demo, contacto y soporte.</w:t>
-            </w:r>
-          </w:p>
-        </w:tc>
-      </w:tr>
-      <w:tr>
-        <w:tc>
-          <w:tcPr/>
-          <w:p>
-            <w:pPr>
-              <w:pStyle w:val="Compact"/>
-            </w:pPr>
-            <w:r>
-              <w:t xml:space="preserve">LinkedIn</w:t>
-            </w:r>
-          </w:p>
-        </w:tc>
-        <w:tc>
-          <w:tcPr/>
-          <w:p>
-            <w:pPr>
-              <w:pStyle w:val="Compact"/>
-            </w:pPr>
-            <w:r>
-              <w:t xml:space="preserve">Publicaciones tecnicas y casos de uso empresariales.</w:t>
-            </w:r>
-          </w:p>
-        </w:tc>
-      </w:tr>
-      <w:tr>
-        <w:tc>
-          <w:tcPr/>
-          <w:p>
-            <w:pPr>
-              <w:pStyle w:val="Compact"/>
-            </w:pPr>
-            <w:r>
-              <w:t xml:space="preserve">Facebook</w:t>
-            </w:r>
-          </w:p>
-        </w:tc>
-        <w:tc>
-          <w:tcPr/>
-          <w:p>
-            <w:pPr>
-              <w:pStyle w:val="Compact"/>
-            </w:pPr>
-            <w:r>
-              <w:t xml:space="preserve">Alcance local y demostraciones visuales.</w:t>
-            </w:r>
-          </w:p>
-        </w:tc>
-      </w:tr>
-      <w:tr>
-        <w:tc>
-          <w:tcPr/>
-          <w:p>
-            <w:pPr>
-              <w:pStyle w:val="Compact"/>
-            </w:pPr>
-            <w:r>
-              <w:t xml:space="preserve">WhatsApp Business</w:t>
-            </w:r>
-          </w:p>
-        </w:tc>
-        <w:tc>
-          <w:tcPr/>
-          <w:p>
-            <w:pPr>
-              <w:pStyle w:val="Compact"/>
-            </w:pPr>
-            <w:r>
-              <w:t xml:space="preserve">Contacto comercial y soporte inicial.</w:t>
-            </w:r>
-          </w:p>
-        </w:tc>
-      </w:tr>
-      <w:tr>
-        <w:tc>
-          <w:tcPr/>
-          <w:p>
-            <w:pPr>
-              <w:pStyle w:val="Compact"/>
-            </w:pPr>
-            <w:r>
-              <w:t xml:space="preserve">Ferias tecnologicas</w:t>
-            </w:r>
-          </w:p>
-        </w:tc>
-        <w:tc>
-          <w:tcPr/>
-          <w:p>
-            <w:pPr>
-              <w:pStyle w:val="Compact"/>
-            </w:pPr>
-            <w:r>
-              <w:t xml:space="preserve">Demostracion presencial con mapas de calor.</w:t>
-            </w:r>
-          </w:p>
-        </w:tc>
-      </w:tr>
-      <w:tr>
-        <w:tc>
-          <w:tcPr/>
-          <w:p>
-            <w:pPr>
-              <w:pStyle w:val="Compact"/>
-            </w:pPr>
-            <w:r>
-              <w:t xml:space="preserve">Convenios academicos</w:t>
-            </w:r>
-          </w:p>
-        </w:tc>
-        <w:tc>
-          <w:tcPr/>
-          <w:p>
-            <w:pPr>
-              <w:pStyle w:val="Compact"/>
-            </w:pPr>
-            <w:r>
-              <w:t xml:space="preserve">Validacion y difusion en entornos educativos.</w:t>
-            </w:r>
-          </w:p>
-        </w:tc>
-      </w:tr>
-      <w:tr>
-        <w:tc>
-          <w:tcPr/>
-          <w:p>
-            <w:pPr>
-              <w:pStyle w:val="Compact"/>
-            </w:pPr>
-            <w:r>
-              <w:t xml:space="preserve">Repositorio GitHub</w:t>
-            </w:r>
-          </w:p>
-        </w:tc>
-        <w:tc>
-          <w:tcPr/>
-          <w:p>
-            <w:pPr>
-              <w:pStyle w:val="Compact"/>
-            </w:pPr>
-            <w:r>
-              <w:t xml:space="preserve">Transparencia tecnica y evidencia del producto.</w:t>
+              <w:t xml:space="preserve">Semana</w:t>
+            </w:r>
+          </w:p>
+        </w:tc>
+        <w:tc>
+          <w:tcPr/>
+          <w:p>
+            <w:pPr>
+              <w:pStyle w:val="Compact"/>
+            </w:pPr>
+            <w:r>
+              <w:t xml:space="preserve">Actividad</w:t>
+            </w:r>
+          </w:p>
+        </w:tc>
+      </w:tr>
+      <w:tr>
+        <w:tc>
+          <w:tcPr/>
+          <w:p>
+            <w:pPr>
+              <w:pStyle w:val="Compact"/>
+            </w:pPr>
+            <w:r>
+              <w:t xml:space="preserve">1</w:t>
+            </w:r>
+          </w:p>
+        </w:tc>
+        <w:tc>
+          <w:tcPr/>
+          <w:p>
+            <w:pPr>
+              <w:pStyle w:val="Compact"/>
+            </w:pPr>
+            <w:r>
+              <w:t xml:space="preserve">Publicar landing institucional y demo tecnica.</w:t>
+            </w:r>
+          </w:p>
+        </w:tc>
+      </w:tr>
+      <w:tr>
+        <w:tc>
+          <w:tcPr/>
+          <w:p>
+            <w:pPr>
+              <w:pStyle w:val="Compact"/>
+            </w:pPr>
+            <w:r>
+              <w:t xml:space="preserve">2</w:t>
+            </w:r>
+          </w:p>
+        </w:tc>
+        <w:tc>
+          <w:tcPr/>
+          <w:p>
+            <w:pPr>
+              <w:pStyle w:val="Compact"/>
+            </w:pPr>
+            <w:r>
+              <w:t xml:space="preserve">Publicar video corto de captura y heatmap.</w:t>
+            </w:r>
+          </w:p>
+        </w:tc>
+      </w:tr>
+      <w:tr>
+        <w:tc>
+          <w:tcPr/>
+          <w:p>
+            <w:pPr>
+              <w:pStyle w:val="Compact"/>
+            </w:pPr>
+            <w:r>
+              <w:t xml:space="preserve">3</w:t>
+            </w:r>
+          </w:p>
+        </w:tc>
+        <w:tc>
+          <w:tcPr/>
+          <w:p>
+            <w:pPr>
+              <w:pStyle w:val="Compact"/>
+            </w:pPr>
+            <w:r>
+              <w:t xml:space="preserve">Contactar 10 integradores o consultores TI.</w:t>
+            </w:r>
+          </w:p>
+        </w:tc>
+      </w:tr>
+      <w:tr>
+        <w:tc>
+          <w:tcPr/>
+          <w:p>
+            <w:pPr>
+              <w:pStyle w:val="Compact"/>
+            </w:pPr>
+            <w:r>
+              <w:t xml:space="preserve">4</w:t>
+            </w:r>
+          </w:p>
+        </w:tc>
+        <w:tc>
+          <w:tcPr/>
+          <w:p>
+            <w:pPr>
+              <w:pStyle w:val="Compact"/>
+            </w:pPr>
+            <w:r>
+              <w:t xml:space="preserve">Ejecutar 2 demostraciones guiadas.</w:t>
+            </w:r>
+          </w:p>
+        </w:tc>
+      </w:tr>
+      <w:tr>
+        <w:tc>
+          <w:tcPr/>
+          <w:p>
+            <w:pPr>
+              <w:pStyle w:val="Compact"/>
+            </w:pPr>
+            <w:r>
+              <w:t xml:space="preserve">5</w:t>
+            </w:r>
+          </w:p>
+        </w:tc>
+        <w:tc>
+          <w:tcPr/>
+          <w:p>
+            <w:pPr>
+              <w:pStyle w:val="Compact"/>
+            </w:pPr>
+            <w:r>
+              <w:t xml:space="preserve">Publicar caso de estudio Bulldog Tech.</w:t>
+            </w:r>
+          </w:p>
+        </w:tc>
+      </w:tr>
+      <w:tr>
+        <w:tc>
+          <w:tcPr/>
+          <w:p>
+            <w:pPr>
+              <w:pStyle w:val="Compact"/>
+            </w:pPr>
+            <w:r>
+              <w:t xml:space="preserve">6</w:t>
+            </w:r>
+          </w:p>
+        </w:tc>
+        <w:tc>
+          <w:tcPr/>
+          <w:p>
+            <w:pPr>
+              <w:pStyle w:val="Compact"/>
+            </w:pPr>
+            <w:r>
+              <w:t xml:space="preserve">Ajustar propuesta comercial segun retroalimentacion.</w:t>
             </w:r>
           </w:p>
         </w:tc>
       </w:tr>
     </w:tbl>
-    <w:bookmarkEnd w:id="175"/>
-    <w:bookmarkStart w:id="176" w:name="material-promocional"/>
+    <w:bookmarkEnd w:id="178"/>
+    <w:bookmarkStart w:id="179" w:name="presupuesto-referencial"/>
     <w:p>
       <w:pPr>
         <w:pStyle w:val="Heading2"/>
       </w:pPr>
       <w:r>
-        <w:t xml:space="preserve">Material promocional</w:t>
-      </w:r>
-    </w:p>
-    <w:p>
-      <w:pPr>
-        <w:pStyle w:val="Compact"/>
-        <w:numPr>
-          <w:ilvl w:val="0"/>
-          <w:numId w:val="1059"/>
-        </w:numPr>
-      </w:pPr>
-      <w:r>
-        <w:t xml:space="preserve">Flyer digital de problema/solucion.</w:t>
-      </w:r>
-    </w:p>
-    <w:p>
-      <w:pPr>
-        <w:pStyle w:val="Compact"/>
-        <w:numPr>
-          <w:ilvl w:val="0"/>
-          <w:numId w:val="1059"/>
-        </w:numPr>
-      </w:pPr>
-      <w:r>
-        <w:t xml:space="preserve">Video demo de 60 a 90 segundos.</w:t>
-      </w:r>
-    </w:p>
-    <w:p>
-      <w:pPr>
-        <w:pStyle w:val="Compact"/>
-        <w:numPr>
-          <w:ilvl w:val="0"/>
-          <w:numId w:val="1059"/>
-        </w:numPr>
-      </w:pPr>
-      <w:r>
-        <w:t xml:space="preserve">Caso de uso con plano, mediciones y heatmap.</w:t>
-      </w:r>
-    </w:p>
-    <w:p>
-      <w:pPr>
-        <w:pStyle w:val="Compact"/>
-        <w:numPr>
-          <w:ilvl w:val="0"/>
-          <w:numId w:val="1059"/>
-        </w:numPr>
-      </w:pPr>
-      <w:r>
-        <w:t xml:space="preserve">Presentacion comercial corta.</w:t>
-      </w:r>
-    </w:p>
-    <w:p>
-      <w:pPr>
-        <w:pStyle w:val="Compact"/>
-        <w:numPr>
-          <w:ilvl w:val="0"/>
-          <w:numId w:val="1059"/>
-        </w:numPr>
-      </w:pPr>
-      <w:r>
-        <w:t xml:space="preserve">Publicaciones comparativas: app gratuita vs. Wireless HeatMapper.</w:t>
-      </w:r>
-    </w:p>
-    <w:p>
-      <w:pPr>
-        <w:pStyle w:val="Compact"/>
-        <w:numPr>
-          <w:ilvl w:val="0"/>
-          <w:numId w:val="1059"/>
-        </w:numPr>
-      </w:pPr>
-      <w:r>
-        <w:t xml:space="preserve">QR hacia demo web, repositorio y releases moviles.</w:t>
-      </w:r>
-    </w:p>
-    <w:bookmarkEnd w:id="176"/>
-    <w:bookmarkStart w:id="177" w:name="calendario-inicial"/>
-    <w:p>
-      <w:pPr>
-        <w:pStyle w:val="Heading2"/>
-      </w:pPr>
-      <w:r>
-        <w:t xml:space="preserve">Calendario inicial</w:t>
+        <w:t xml:space="preserve">Presupuesto referencial</w:t>
       </w:r>
     </w:p>
     <w:tbl>
@@ -20132,434 +20358,242 @@
               <w:pStyle w:val="Compact"/>
             </w:pPr>
             <w:r>
-              <w:t xml:space="preserve">Semana</w:t>
-            </w:r>
-          </w:p>
-        </w:tc>
-        <w:tc>
-          <w:tcPr/>
-          <w:p>
-            <w:pPr>
-              <w:pStyle w:val="Compact"/>
-            </w:pPr>
-            <w:r>
-              <w:t xml:space="preserve">Actividad</w:t>
-            </w:r>
-          </w:p>
-        </w:tc>
-      </w:tr>
-      <w:tr>
-        <w:tc>
-          <w:tcPr/>
-          <w:p>
-            <w:pPr>
-              <w:pStyle w:val="Compact"/>
-            </w:pPr>
-            <w:r>
-              <w:t xml:space="preserve">1</w:t>
-            </w:r>
-          </w:p>
-        </w:tc>
-        <w:tc>
-          <w:tcPr/>
-          <w:p>
-            <w:pPr>
-              <w:pStyle w:val="Compact"/>
-            </w:pPr>
-            <w:r>
-              <w:t xml:space="preserve">Publicar landing institucional y demo tecnica.</w:t>
-            </w:r>
-          </w:p>
-        </w:tc>
-      </w:tr>
-      <w:tr>
-        <w:tc>
-          <w:tcPr/>
-          <w:p>
-            <w:pPr>
-              <w:pStyle w:val="Compact"/>
-            </w:pPr>
-            <w:r>
-              <w:t xml:space="preserve">2</w:t>
-            </w:r>
-          </w:p>
-        </w:tc>
-        <w:tc>
-          <w:tcPr/>
-          <w:p>
-            <w:pPr>
-              <w:pStyle w:val="Compact"/>
-            </w:pPr>
-            <w:r>
-              <w:t xml:space="preserve">Publicar video corto de captura y heatmap.</w:t>
-            </w:r>
-          </w:p>
-        </w:tc>
-      </w:tr>
-      <w:tr>
-        <w:tc>
-          <w:tcPr/>
-          <w:p>
-            <w:pPr>
-              <w:pStyle w:val="Compact"/>
-            </w:pPr>
-            <w:r>
-              <w:t xml:space="preserve">3</w:t>
-            </w:r>
-          </w:p>
-        </w:tc>
-        <w:tc>
-          <w:tcPr/>
-          <w:p>
-            <w:pPr>
-              <w:pStyle w:val="Compact"/>
-            </w:pPr>
-            <w:r>
-              <w:t xml:space="preserve">Contactar 10 integradores o consultores TI.</w:t>
-            </w:r>
-          </w:p>
-        </w:tc>
-      </w:tr>
-      <w:tr>
-        <w:tc>
-          <w:tcPr/>
-          <w:p>
-            <w:pPr>
-              <w:pStyle w:val="Compact"/>
-            </w:pPr>
-            <w:r>
-              <w:t xml:space="preserve">4</w:t>
-            </w:r>
-          </w:p>
-        </w:tc>
-        <w:tc>
-          <w:tcPr/>
-          <w:p>
-            <w:pPr>
-              <w:pStyle w:val="Compact"/>
-            </w:pPr>
-            <w:r>
-              <w:t xml:space="preserve">Ejecutar 2 demostraciones guiadas.</w:t>
-            </w:r>
-          </w:p>
-        </w:tc>
-      </w:tr>
-      <w:tr>
-        <w:tc>
-          <w:tcPr/>
-          <w:p>
-            <w:pPr>
-              <w:pStyle w:val="Compact"/>
-            </w:pPr>
-            <w:r>
-              <w:t xml:space="preserve">5</w:t>
-            </w:r>
-          </w:p>
-        </w:tc>
-        <w:tc>
-          <w:tcPr/>
-          <w:p>
-            <w:pPr>
-              <w:pStyle w:val="Compact"/>
-            </w:pPr>
-            <w:r>
-              <w:t xml:space="preserve">Publicar caso de estudio Bulldog Tech.</w:t>
-            </w:r>
-          </w:p>
-        </w:tc>
-      </w:tr>
-      <w:tr>
-        <w:tc>
-          <w:tcPr/>
-          <w:p>
-            <w:pPr>
-              <w:pStyle w:val="Compact"/>
-            </w:pPr>
-            <w:r>
-              <w:t xml:space="preserve">6</w:t>
-            </w:r>
-          </w:p>
-        </w:tc>
-        <w:tc>
-          <w:tcPr/>
-          <w:p>
-            <w:pPr>
-              <w:pStyle w:val="Compact"/>
-            </w:pPr>
-            <w:r>
-              <w:t xml:space="preserve">Ajustar propuesta comercial segun retroalimentacion.</w:t>
+              <w:t xml:space="preserve">Concepto</w:t>
+            </w:r>
+          </w:p>
+        </w:tc>
+        <w:tc>
+          <w:tcPr/>
+          <w:p>
+            <w:pPr>
+              <w:pStyle w:val="Compact"/>
+            </w:pPr>
+            <w:r>
+              <w:t xml:space="preserve">Monto mensual</w:t>
+            </w:r>
+          </w:p>
+        </w:tc>
+      </w:tr>
+      <w:tr>
+        <w:tc>
+          <w:tcPr/>
+          <w:p>
+            <w:pPr>
+              <w:pStyle w:val="Compact"/>
+            </w:pPr>
+            <w:r>
+              <w:t xml:space="preserve">Diseno de piezas basicas</w:t>
+            </w:r>
+          </w:p>
+        </w:tc>
+        <w:tc>
+          <w:tcPr/>
+          <w:p>
+            <w:pPr>
+              <w:pStyle w:val="Compact"/>
+            </w:pPr>
+            <w:r>
+              <w:t xml:space="preserve">USD 30</w:t>
+            </w:r>
+          </w:p>
+        </w:tc>
+      </w:tr>
+      <w:tr>
+        <w:tc>
+          <w:tcPr/>
+          <w:p>
+            <w:pPr>
+              <w:pStyle w:val="Compact"/>
+            </w:pPr>
+            <w:r>
+              <w:t xml:space="preserve">Publicidad digital local</w:t>
+            </w:r>
+          </w:p>
+        </w:tc>
+        <w:tc>
+          <w:tcPr/>
+          <w:p>
+            <w:pPr>
+              <w:pStyle w:val="Compact"/>
+            </w:pPr>
+            <w:r>
+              <w:t xml:space="preserve">USD 50 a USD 100</w:t>
+            </w:r>
+          </w:p>
+        </w:tc>
+      </w:tr>
+      <w:tr>
+        <w:tc>
+          <w:tcPr/>
+          <w:p>
+            <w:pPr>
+              <w:pStyle w:val="Compact"/>
+            </w:pPr>
+            <w:r>
+              <w:t xml:space="preserve">Dominio o correo institucional</w:t>
+            </w:r>
+          </w:p>
+        </w:tc>
+        <w:tc>
+          <w:tcPr/>
+          <w:p>
+            <w:pPr>
+              <w:pStyle w:val="Compact"/>
+            </w:pPr>
+            <w:r>
+              <w:t xml:space="preserve">USD 1 a USD 5 prorrateado</w:t>
+            </w:r>
+          </w:p>
+        </w:tc>
+      </w:tr>
+      <w:tr>
+        <w:tc>
+          <w:tcPr/>
+          <w:p>
+            <w:pPr>
+              <w:pStyle w:val="Compact"/>
+            </w:pPr>
+            <w:r>
+              <w:t xml:space="preserve">Demo y soporte comercial</w:t>
+            </w:r>
+          </w:p>
+        </w:tc>
+        <w:tc>
+          <w:tcPr/>
+          <w:p>
+            <w:pPr>
+              <w:pStyle w:val="Compact"/>
+            </w:pPr>
+            <w:r>
+              <w:t xml:space="preserve">10 horas de equipo</w:t>
             </w:r>
           </w:p>
         </w:tc>
       </w:tr>
     </w:tbl>
-    <w:bookmarkEnd w:id="177"/>
-    <w:bookmarkStart w:id="178" w:name="presupuesto-referencial"/>
+    <w:bookmarkEnd w:id="179"/>
+    <w:bookmarkStart w:id="180" w:name="metricas"/>
     <w:p>
       <w:pPr>
         <w:pStyle w:val="Heading2"/>
       </w:pPr>
       <w:r>
-        <w:t xml:space="preserve">Presupuesto referencial</w:t>
-      </w:r>
-    </w:p>
-    <w:tbl>
-      <w:tblPr>
-        <w:tblStyle w:val="Table"/>
-        <w:tblW w:type="auto" w:w="0"/>
-        <w:tblLook w:firstRow="1" w:lastRow="0" w:firstColumn="0" w:lastColumn="0" w:noHBand="0" w:noVBand="0" w:val="0020"/>
-      </w:tblPr>
-      <w:tblGrid>
-        <w:gridCol w:w="3960"/>
-        <w:gridCol w:w="3960"/>
-      </w:tblGrid>
-      <w:tr>
-        <w:trPr>
-          <w:tblHeader w:val="on"/>
-        </w:trPr>
-        <w:tc>
-          <w:tcPr/>
-          <w:p>
-            <w:pPr>
-              <w:pStyle w:val="Compact"/>
-            </w:pPr>
-            <w:r>
-              <w:t xml:space="preserve">Concepto</w:t>
-            </w:r>
-          </w:p>
-        </w:tc>
-        <w:tc>
-          <w:tcPr/>
-          <w:p>
-            <w:pPr>
-              <w:pStyle w:val="Compact"/>
-            </w:pPr>
-            <w:r>
-              <w:t xml:space="preserve">Monto mensual</w:t>
-            </w:r>
-          </w:p>
-        </w:tc>
-      </w:tr>
-      <w:tr>
-        <w:tc>
-          <w:tcPr/>
-          <w:p>
-            <w:pPr>
-              <w:pStyle w:val="Compact"/>
-            </w:pPr>
-            <w:r>
-              <w:t xml:space="preserve">Diseno de piezas basicas</w:t>
-            </w:r>
-          </w:p>
-        </w:tc>
-        <w:tc>
-          <w:tcPr/>
-          <w:p>
-            <w:pPr>
-              <w:pStyle w:val="Compact"/>
-            </w:pPr>
-            <w:r>
-              <w:t xml:space="preserve">USD 30</w:t>
-            </w:r>
-          </w:p>
-        </w:tc>
-      </w:tr>
-      <w:tr>
-        <w:tc>
-          <w:tcPr/>
-          <w:p>
-            <w:pPr>
-              <w:pStyle w:val="Compact"/>
-            </w:pPr>
-            <w:r>
-              <w:t xml:space="preserve">Publicidad digital local</w:t>
-            </w:r>
-          </w:p>
-        </w:tc>
-        <w:tc>
-          <w:tcPr/>
-          <w:p>
-            <w:pPr>
-              <w:pStyle w:val="Compact"/>
-            </w:pPr>
-            <w:r>
-              <w:t xml:space="preserve">USD 50 a USD 100</w:t>
-            </w:r>
-          </w:p>
-        </w:tc>
-      </w:tr>
-      <w:tr>
-        <w:tc>
-          <w:tcPr/>
-          <w:p>
-            <w:pPr>
-              <w:pStyle w:val="Compact"/>
-            </w:pPr>
-            <w:r>
-              <w:t xml:space="preserve">Dominio o correo institucional</w:t>
-            </w:r>
-          </w:p>
-        </w:tc>
-        <w:tc>
-          <w:tcPr/>
-          <w:p>
-            <w:pPr>
-              <w:pStyle w:val="Compact"/>
-            </w:pPr>
-            <w:r>
-              <w:t xml:space="preserve">USD 1 a USD 5 prorrateado</w:t>
-            </w:r>
-          </w:p>
-        </w:tc>
-      </w:tr>
-      <w:tr>
-        <w:tc>
-          <w:tcPr/>
-          <w:p>
-            <w:pPr>
-              <w:pStyle w:val="Compact"/>
-            </w:pPr>
-            <w:r>
-              <w:t xml:space="preserve">Demo y soporte comercial</w:t>
-            </w:r>
-          </w:p>
-        </w:tc>
-        <w:tc>
-          <w:tcPr/>
-          <w:p>
-            <w:pPr>
-              <w:pStyle w:val="Compact"/>
-            </w:pPr>
-            <w:r>
-              <w:t xml:space="preserve">10 horas de equipo</w:t>
-            </w:r>
-          </w:p>
-        </w:tc>
-      </w:tr>
-    </w:tbl>
-    <w:bookmarkEnd w:id="178"/>
-    <w:bookmarkStart w:id="179" w:name="metricas"/>
+        <w:t xml:space="preserve">Metricas</w:t>
+      </w:r>
+    </w:p>
+    <w:p>
+      <w:pPr>
+        <w:pStyle w:val="Compact"/>
+        <w:numPr>
+          <w:ilvl w:val="0"/>
+          <w:numId w:val="1060"/>
+        </w:numPr>
+      </w:pPr>
+      <w:r>
+        <w:t xml:space="preserve">Visitantes al sitio.</w:t>
+      </w:r>
+    </w:p>
+    <w:p>
+      <w:pPr>
+        <w:pStyle w:val="Compact"/>
+        <w:numPr>
+          <w:ilvl w:val="0"/>
+          <w:numId w:val="1060"/>
+        </w:numPr>
+      </w:pPr>
+      <w:r>
+        <w:t xml:space="preserve">Clics en QR o enlaces publicos.</w:t>
+      </w:r>
+    </w:p>
+    <w:p>
+      <w:pPr>
+        <w:pStyle w:val="Compact"/>
+        <w:numPr>
+          <w:ilvl w:val="0"/>
+          <w:numId w:val="1060"/>
+        </w:numPr>
+      </w:pPr>
+      <w:r>
+        <w:t xml:space="preserve">Contactos recibidos.</w:t>
+      </w:r>
+    </w:p>
+    <w:p>
+      <w:pPr>
+        <w:pStyle w:val="Compact"/>
+        <w:numPr>
+          <w:ilvl w:val="0"/>
+          <w:numId w:val="1060"/>
+        </w:numPr>
+      </w:pPr>
+      <w:r>
+        <w:t xml:space="preserve">Demos agendadas.</w:t>
+      </w:r>
+    </w:p>
+    <w:p>
+      <w:pPr>
+        <w:pStyle w:val="Compact"/>
+        <w:numPr>
+          <w:ilvl w:val="0"/>
+          <w:numId w:val="1060"/>
+        </w:numPr>
+      </w:pPr>
+      <w:r>
+        <w:t xml:space="preserve">Pilotos iniciados.</w:t>
+      </w:r>
+    </w:p>
+    <w:p>
+      <w:pPr>
+        <w:pStyle w:val="Compact"/>
+        <w:numPr>
+          <w:ilvl w:val="0"/>
+          <w:numId w:val="1060"/>
+        </w:numPr>
+      </w:pPr>
+      <w:r>
+        <w:t xml:space="preserve">Conversion a plan pago.</w:t>
+      </w:r>
+    </w:p>
+    <w:p>
+      <w:pPr>
+        <w:pStyle w:val="Compact"/>
+        <w:numPr>
+          <w:ilvl w:val="0"/>
+          <w:numId w:val="1060"/>
+        </w:numPr>
+      </w:pPr>
+      <w:r>
+        <w:t xml:space="preserve">Costo por lead.</w:t>
+      </w:r>
+    </w:p>
+    <w:p>
+      <w:pPr>
+        <w:pStyle w:val="Compact"/>
+        <w:numPr>
+          <w:ilvl w:val="0"/>
+          <w:numId w:val="1060"/>
+        </w:numPr>
+      </w:pPr>
+      <w:r>
+        <w:t xml:space="preserve">Retencion posterior al primer mes.</w:t>
+      </w:r>
+    </w:p>
+    <w:bookmarkEnd w:id="180"/>
+    <w:bookmarkEnd w:id="181"/>
+    <w:bookmarkStart w:id="193" w:name="aspectos-para-la-puesta-en-marcha"/>
+    <w:p>
+      <w:pPr>
+        <w:pStyle w:val="Heading1"/>
+      </w:pPr>
+      <w:r>
+        <w:t xml:space="preserve">Aspectos para la puesta en marcha</w:t>
+      </w:r>
+    </w:p>
+    <w:bookmarkStart w:id="182" w:name="objetivo-1"/>
     <w:p>
       <w:pPr>
         <w:pStyle w:val="Heading2"/>
       </w:pPr>
       <w:r>
-        <w:t xml:space="preserve">Metricas</w:t>
-      </w:r>
-    </w:p>
-    <w:p>
-      <w:pPr>
-        <w:pStyle w:val="Compact"/>
-        <w:numPr>
-          <w:ilvl w:val="0"/>
-          <w:numId w:val="1060"/>
-        </w:numPr>
-      </w:pPr>
-      <w:r>
-        <w:t xml:space="preserve">Visitantes al sitio.</w:t>
-      </w:r>
-    </w:p>
-    <w:p>
-      <w:pPr>
-        <w:pStyle w:val="Compact"/>
-        <w:numPr>
-          <w:ilvl w:val="0"/>
-          <w:numId w:val="1060"/>
-        </w:numPr>
-      </w:pPr>
-      <w:r>
-        <w:t xml:space="preserve">Clics en QR o enlaces publicos.</w:t>
-      </w:r>
-    </w:p>
-    <w:p>
-      <w:pPr>
-        <w:pStyle w:val="Compact"/>
-        <w:numPr>
-          <w:ilvl w:val="0"/>
-          <w:numId w:val="1060"/>
-        </w:numPr>
-      </w:pPr>
-      <w:r>
-        <w:t xml:space="preserve">Contactos recibidos.</w:t>
-      </w:r>
-    </w:p>
-    <w:p>
-      <w:pPr>
-        <w:pStyle w:val="Compact"/>
-        <w:numPr>
-          <w:ilvl w:val="0"/>
-          <w:numId w:val="1060"/>
-        </w:numPr>
-      </w:pPr>
-      <w:r>
-        <w:t xml:space="preserve">Demos agendadas.</w:t>
-      </w:r>
-    </w:p>
-    <w:p>
-      <w:pPr>
-        <w:pStyle w:val="Compact"/>
-        <w:numPr>
-          <w:ilvl w:val="0"/>
-          <w:numId w:val="1060"/>
-        </w:numPr>
-      </w:pPr>
-      <w:r>
-        <w:t xml:space="preserve">Pilotos iniciados.</w:t>
-      </w:r>
-    </w:p>
-    <w:p>
-      <w:pPr>
-        <w:pStyle w:val="Compact"/>
-        <w:numPr>
-          <w:ilvl w:val="0"/>
-          <w:numId w:val="1060"/>
-        </w:numPr>
-      </w:pPr>
-      <w:r>
-        <w:t xml:space="preserve">Conversion a plan pago.</w:t>
-      </w:r>
-    </w:p>
-    <w:p>
-      <w:pPr>
-        <w:pStyle w:val="Compact"/>
-        <w:numPr>
-          <w:ilvl w:val="0"/>
-          <w:numId w:val="1060"/>
-        </w:numPr>
-      </w:pPr>
-      <w:r>
-        <w:t xml:space="preserve">Costo por lead.</w:t>
-      </w:r>
-    </w:p>
-    <w:p>
-      <w:pPr>
-        <w:pStyle w:val="Compact"/>
-        <w:numPr>
-          <w:ilvl w:val="0"/>
-          <w:numId w:val="1060"/>
-        </w:numPr>
-      </w:pPr>
-      <w:r>
-        <w:t xml:space="preserve">Retencion posterior al primer mes.</w:t>
-      </w:r>
-    </w:p>
-    <w:bookmarkEnd w:id="179"/>
-    <w:bookmarkEnd w:id="180"/>
-    <w:bookmarkStart w:id="192" w:name="aspectos-para-la-puesta-en-marcha"/>
-    <w:p>
-      <w:pPr>
-        <w:pStyle w:val="Heading1"/>
-      </w:pPr>
-      <w:r>
-        <w:t xml:space="preserve">Aspectos para la puesta en marcha</w:t>
-      </w:r>
-    </w:p>
-    <w:bookmarkStart w:id="181" w:name="objetivo-1"/>
-    <w:p>
-      <w:pPr>
-        <w:pStyle w:val="Heading2"/>
-      </w:pPr>
-      <w:r>
         <w:t xml:space="preserve">Objetivo</w:t>
       </w:r>
     </w:p>
@@ -20571,8 +20605,8 @@
         <w:t xml:space="preserve">Definir las condiciones necesarias para operar Wireless HeatMapper como producto real: infraestructura cloud, costos, licenciamiento, cuentas de publicacion movil, terminos legales, privacidad y adopcion asistida por IA.</w:t>
       </w:r>
     </w:p>
-    <w:bookmarkEnd w:id="181"/>
-    <w:bookmarkStart w:id="182" w:name="comparacion-cloud"/>
+    <w:bookmarkEnd w:id="182"/>
+    <w:bookmarkStart w:id="183" w:name="comparacion-cloud"/>
     <w:p>
       <w:pPr>
         <w:pStyle w:val="Heading2"/>
@@ -20882,8 +20916,8 @@
         </w:tc>
       </w:tr>
     </w:tbl>
-    <w:bookmarkEnd w:id="182"/>
-    <w:bookmarkStart w:id="183" w:name="proyeccion-de-costos-iniciales"/>
+    <w:bookmarkEnd w:id="183"/>
+    <w:bookmarkStart w:id="184" w:name="proyeccion-de-costos-iniciales"/>
     <w:p>
       <w:pPr>
         <w:pStyle w:val="Heading2"/>
@@ -21099,8 +21133,8 @@
         <w:t xml:space="preserve">Para la entrega academica se utiliza Azure por disponibilidad actual del frontend publicado. Para operacion comercial, se recomienda mantener el escenario base hasta validar clientes pagos.</w:t>
       </w:r>
     </w:p>
-    <w:bookmarkEnd w:id="183"/>
-    <w:bookmarkStart w:id="186" w:name="cuentas-de-tiendas-moviles"/>
+    <w:bookmarkEnd w:id="184"/>
+    <w:bookmarkStart w:id="187" w:name="cuentas-de-tiendas-moviles"/>
     <w:p>
       <w:pPr>
         <w:pStyle w:val="Heading2"/>
@@ -21109,7 +21143,7 @@
         <w:t xml:space="preserve">Cuentas de tiendas moviles</w:t>
       </w:r>
     </w:p>
-    <w:bookmarkStart w:id="184" w:name="google-play"/>
+    <w:bookmarkStart w:id="185" w:name="google-play"/>
     <w:p>
       <w:pPr>
         <w:pStyle w:val="Heading3"/>
@@ -21126,8 +21160,8 @@
         <w:t xml:space="preserve">Google Play Console requiere cuenta de Google, aceptacion del Developer Distribution Agreement, verificacion de identidad, seleccion de tipo de cuenta personal u organizacion y pago unico de registro de USD 25. Las cuentas personales nuevas tienen requisitos adicionales de pruebas antes de distribucion publica.</w:t>
       </w:r>
     </w:p>
-    <w:bookmarkEnd w:id="184"/>
-    <w:bookmarkStart w:id="185" w:name="apple-developer"/>
+    <w:bookmarkEnd w:id="185"/>
+    <w:bookmarkStart w:id="186" w:name="apple-developer"/>
     <w:p>
       <w:pPr>
         <w:pStyle w:val="Heading3"/>
@@ -21144,9 +21178,9 @@
         <w:t xml:space="preserve">Apple Developer Program tiene membresia anual de USD 99 para distribucion en App Store. La inscripcion puede ser individual u organizacion. Las organizaciones deben verificar identidad, contar con D-U-N-S Number y acreditar autoridad para vincular legalmente a la entidad.</w:t>
       </w:r>
     </w:p>
-    <w:bookmarkEnd w:id="185"/>
     <w:bookmarkEnd w:id="186"/>
-    <w:bookmarkStart w:id="187" w:name="tipo-de-licencia"/>
+    <w:bookmarkEnd w:id="187"/>
+    <w:bookmarkStart w:id="188" w:name="tipo-de-licencia"/>
     <w:p>
       <w:pPr>
         <w:pStyle w:val="Heading2"/>
@@ -21219,8 +21253,8 @@
         <w:t xml:space="preserve">Tambien puede ofrecerse licencia por proyecto unico para consultores o clientes con baja recurrencia. No se recomienda on-premise en la primera etapa porque incrementa soporte, instalacion y complejidad operativa.</w:t>
       </w:r>
     </w:p>
-    <w:bookmarkEnd w:id="187"/>
-    <w:bookmarkStart w:id="188" w:name="terminos-y-condiciones"/>
+    <w:bookmarkEnd w:id="188"/>
+    <w:bookmarkStart w:id="189" w:name="terminos-y-condiciones"/>
     <w:p>
       <w:pPr>
         <w:pStyle w:val="Heading2"/>
@@ -21357,8 +21391,8 @@
         <w:t xml:space="preserve">Cambios al servicio.</w:t>
       </w:r>
     </w:p>
-    <w:bookmarkEnd w:id="188"/>
-    <w:bookmarkStart w:id="189" w:name="politica-de-privacidad"/>
+    <w:bookmarkEnd w:id="189"/>
+    <w:bookmarkStart w:id="190" w:name="politica-de-privacidad"/>
     <w:p>
       <w:pPr>
         <w:pStyle w:val="Heading2"/>
@@ -21447,8 +21481,8 @@
         <w:t xml:space="preserve">Derechos del usuario: acceso, correccion, eliminacion cuando corresponda.</w:t>
       </w:r>
     </w:p>
-    <w:bookmarkEnd w:id="189"/>
-    <w:bookmarkStart w:id="190" w:name="adopcion-asistida-por-ia"/>
+    <w:bookmarkEnd w:id="190"/>
+    <w:bookmarkStart w:id="191" w:name="adopcion-asistida-por-ia"/>
     <w:p>
       <w:pPr>
         <w:pStyle w:val="Heading2"/>
@@ -21513,8 +21547,8 @@
         <w:t xml:space="preserve">Si el cliente consulta portal, explicar interpretacion de colores y RSSI.</w:t>
       </w:r>
     </w:p>
-    <w:bookmarkEnd w:id="190"/>
-    <w:bookmarkStart w:id="191" w:name="fuentes-oficiales-de-costos-y-cuentas"/>
+    <w:bookmarkEnd w:id="191"/>
+    <w:bookmarkStart w:id="192" w:name="fuentes-oficiales-de-costos-y-cuentas"/>
     <w:p>
       <w:pPr>
         <w:pStyle w:val="Heading2"/>
@@ -21583,9 +21617,9 @@
         <w:t xml:space="preserve">Apple Developer Program.</w:t>
       </w:r>
     </w:p>
-    <w:bookmarkEnd w:id="191"/>
     <w:bookmarkEnd w:id="192"/>
-    <w:bookmarkStart w:id="215" w:name="software-como-producto"/>
+    <w:bookmarkEnd w:id="193"/>
+    <w:bookmarkStart w:id="216" w:name="software-como-producto"/>
     <w:p>
       <w:pPr>
         <w:pStyle w:val="Heading1"/>
@@ -21594,7 +21628,7 @@
         <w:t xml:space="preserve">Software como producto</w:t>
       </w:r>
     </w:p>
-    <w:bookmarkStart w:id="193" w:name="identificacion-del-producto"/>
+    <w:bookmarkStart w:id="194" w:name="identificacion-del-producto"/>
     <w:p>
       <w:pPr>
         <w:pStyle w:val="Heading2"/>
@@ -21709,8 +21743,8 @@
         <w:t xml:space="preserve">Wireless HeatMapper se entrega como un producto integrado para relevamiento, analisis y publicacion de cobertura WiFi. La aplicacion movil funciona como cliente delgado para tecnicos de campo; el backend concentra autenticacion, reglas de negocio, persistencia, generacion de mapas de calor e inteligencia artificial; y la plataforma web permite administracion organizacional, revision tecnica y acceso controlado del cliente final.</w:t>
       </w:r>
     </w:p>
-    <w:bookmarkEnd w:id="193"/>
-    <w:bookmarkStart w:id="201" w:name="urls-y-artefactos-publicos"/>
+    <w:bookmarkEnd w:id="194"/>
+    <w:bookmarkStart w:id="202" w:name="urls-y-artefactos-publicos"/>
     <w:p>
       <w:pPr>
         <w:pStyle w:val="Heading2"/>
@@ -21787,7 +21821,7 @@
             <w:pPr>
               <w:pStyle w:val="Compact"/>
             </w:pPr>
-            <w:hyperlink r:id="rId194">
+            <w:hyperlink r:id="rId195">
               <w:r>
                 <w:rPr>
                   <w:rStyle w:val="Hyperlink"/>
@@ -21817,7 +21851,7 @@
               <w:pStyle w:val="Compact"/>
             </w:pPr>
             <w:r>
-              <w:t xml:space="preserve">Frontend publicado</w:t>
+              <w:t xml:space="preserve">Sitio empresarial Team 24 Software</w:t>
             </w:r>
           </w:p>
         </w:tc>
@@ -21844,7 +21878,7 @@
               <w:pStyle w:val="Compact"/>
             </w:pPr>
             <w:r>
-              <w:t xml:space="preserve">Entrada publica al panel web y portal de cliente.</w:t>
+              <w:t xml:space="preserve">Entrada publica institucional, acceso a producto, descargas, soporte y contacto.</w:t>
             </w:r>
           </w:p>
         </w:tc>
@@ -21867,7 +21901,7 @@
             <w:pPr>
               <w:pStyle w:val="Compact"/>
             </w:pPr>
-            <w:hyperlink r:id="rId195">
+            <w:hyperlink r:id="rId196">
               <w:r>
                 <w:rPr>
                   <w:rStyle w:val="Hyperlink"/>
@@ -21945,7 +21979,7 @@
             <w:pPr>
               <w:pStyle w:val="Compact"/>
             </w:pPr>
-            <w:hyperlink r:id="rId196">
+            <w:hyperlink r:id="rId197">
               <w:r>
                 <w:rPr>
                   <w:rStyle w:val="Hyperlink"/>
@@ -21985,7 +22019,7 @@
             <w:pPr>
               <w:pStyle w:val="Compact"/>
             </w:pPr>
-            <w:hyperlink r:id="rId197">
+            <w:hyperlink r:id="rId198">
               <w:r>
                 <w:rPr>
                   <w:rStyle w:val="Hyperlink"/>
@@ -22025,7 +22059,7 @@
             <w:pPr>
               <w:pStyle w:val="Compact"/>
             </w:pPr>
-            <w:hyperlink r:id="rId198">
+            <w:hyperlink r:id="rId199">
               <w:r>
                 <w:rPr>
                   <w:rStyle w:val="Hyperlink"/>
@@ -22065,7 +22099,7 @@
             <w:pPr>
               <w:pStyle w:val="Compact"/>
             </w:pPr>
-            <w:hyperlink r:id="rId199">
+            <w:hyperlink r:id="rId200">
               <w:r>
                 <w:rPr>
                   <w:rStyle w:val="Hyperlink"/>
@@ -22105,7 +22139,7 @@
             <w:pPr>
               <w:pStyle w:val="Compact"/>
             </w:pPr>
-            <w:hyperlink r:id="rId200">
+            <w:hyperlink r:id="rId201">
               <w:r>
                 <w:rPr>
                   <w:rStyle w:val="Hyperlink"/>
@@ -22133,11 +22167,11 @@
         <w:pStyle w:val="BodyText"/>
       </w:pPr>
       <w:r>
-        <w:t xml:space="preserve">Estas URLs son las referencias publicas para entrega academica, demostracion y continuidad. En anexos se incorporan codigos QR hacia repositorio, frontend publicado, manual de usuario y releases moviles.</w:t>
-      </w:r>
-    </w:p>
-    <w:bookmarkEnd w:id="201"/>
-    <w:bookmarkStart w:id="202" w:name="componentes-entregables"/>
+        <w:t xml:space="preserve">Estas URLs son las referencias publicas para entrega academica, demostracion y continuidad. En anexos se incorporan codigos QR hacia repositorio, sitio empresarial, documentacion OpenAPI, manual de usuario y releases moviles.</w:t>
+      </w:r>
+    </w:p>
+    <w:bookmarkEnd w:id="202"/>
+    <w:bookmarkStart w:id="203" w:name="componentes-entregables"/>
     <w:p>
       <w:pPr>
         <w:pStyle w:val="Heading2"/>
@@ -22353,8 +22387,8 @@
         </w:tc>
       </w:tr>
     </w:tbl>
-    <w:bookmarkEnd w:id="202"/>
-    <w:bookmarkStart w:id="203" w:name="componentes-backend"/>
+    <w:bookmarkEnd w:id="203"/>
+    <w:bookmarkStart w:id="204" w:name="componentes-backend"/>
     <w:p>
       <w:pPr>
         <w:pStyle w:val="Heading2"/>
@@ -22666,8 +22700,8 @@
         </w:tc>
       </w:tr>
     </w:tbl>
-    <w:bookmarkEnd w:id="203"/>
-    <w:bookmarkStart w:id="204" w:name="componentes-web"/>
+    <w:bookmarkEnd w:id="204"/>
+    <w:bookmarkStart w:id="205" w:name="componentes-web"/>
     <w:p>
       <w:pPr>
         <w:pStyle w:val="Heading2"/>
@@ -22931,8 +22965,8 @@
         </w:tc>
       </w:tr>
     </w:tbl>
-    <w:bookmarkEnd w:id="204"/>
-    <w:bookmarkStart w:id="205" w:name="componentes-moviles"/>
+    <w:bookmarkEnd w:id="205"/>
+    <w:bookmarkStart w:id="206" w:name="componentes-moviles"/>
     <w:p>
       <w:pPr>
         <w:pStyle w:val="Heading2"/>
@@ -23216,8 +23250,8 @@
         <w:t xml:space="preserve">La app movil conserva solamente credenciales de sesion y preferencias minimas necesarias. No almacena datos de dominio entre sesiones ni implementa sincronizacion diferida.</w:t>
       </w:r>
     </w:p>
-    <w:bookmarkEnd w:id="205"/>
-    <w:bookmarkStart w:id="206" w:name="funcionalidades-principales-por-actor"/>
+    <w:bookmarkEnd w:id="206"/>
+    <w:bookmarkStart w:id="207" w:name="funcionalidades-principales-por-actor"/>
     <w:p>
       <w:pPr>
         <w:pStyle w:val="Heading2"/>
@@ -23385,8 +23419,8 @@
         </w:tc>
       </w:tr>
     </w:tbl>
-    <w:bookmarkEnd w:id="206"/>
-    <w:bookmarkStart w:id="207" w:name="flujo-de-valor-extremo-a-extremo"/>
+    <w:bookmarkEnd w:id="207"/>
+    <w:bookmarkStart w:id="208" w:name="flujo-de-valor-extremo-a-extremo"/>
     <w:p>
       <w:pPr>
         <w:pStyle w:val="Heading2"/>
@@ -23511,8 +23545,8 @@
         <w:t xml:space="preserve">Este flujo demuestra la modalidad 100 % en linea: todas las operaciones de dominio dependen del backend y de la base central.</w:t>
       </w:r>
     </w:p>
-    <w:bookmarkEnd w:id="207"/>
-    <w:bookmarkStart w:id="208" w:name="releases-moviles"/>
+    <w:bookmarkEnd w:id="208"/>
+    <w:bookmarkStart w:id="209" w:name="releases-moviles"/>
     <w:p>
       <w:pPr>
         <w:pStyle w:val="Heading2"/>
@@ -23822,8 +23856,8 @@
         <w:t xml:space="preserve">cuando se genera desde ejecucion manual.</w:t>
       </w:r>
     </w:p>
-    <w:bookmarkEnd w:id="208"/>
-    <w:bookmarkStart w:id="209" w:name="repositorio-y-trazabilidad-tecnica"/>
+    <w:bookmarkEnd w:id="209"/>
+    <w:bookmarkStart w:id="210" w:name="repositorio-y-trazabilidad-tecnica"/>
     <w:p>
       <w:pPr>
         <w:pStyle w:val="Heading2"/>
@@ -24057,8 +24091,8 @@
         </w:tc>
       </w:tr>
     </w:tbl>
-    <w:bookmarkEnd w:id="209"/>
-    <w:bookmarkStart w:id="210" w:name="criterios-de-producto-terminado"/>
+    <w:bookmarkEnd w:id="210"/>
+    <w:bookmarkStart w:id="211" w:name="criterios-de-producto-terminado"/>
     <w:p>
       <w:pPr>
         <w:pStyle w:val="Heading2"/>
@@ -24298,8 +24332,8 @@
         </w:tc>
       </w:tr>
     </w:tbl>
-    <w:bookmarkEnd w:id="210"/>
-    <w:bookmarkStart w:id="211" w:name="soporte-inicial"/>
+    <w:bookmarkEnd w:id="211"/>
+    <w:bookmarkStart w:id="212" w:name="soporte-inicial"/>
     <w:p>
       <w:pPr>
         <w:pStyle w:val="Heading2"/>
@@ -24573,8 +24607,8 @@
         <w:t xml:space="preserve">Clasificacion por severidad: critica, alta, media o baja.</w:t>
       </w:r>
     </w:p>
-    <w:bookmarkEnd w:id="211"/>
-    <w:bookmarkStart w:id="212" w:name="versionado"/>
+    <w:bookmarkEnd w:id="212"/>
+    <w:bookmarkStart w:id="213" w:name="versionado"/>
     <w:p>
       <w:pPr>
         <w:pStyle w:val="Heading2"/>
@@ -24936,8 +24970,8 @@
         <w:t xml:space="preserve">Evidencias de pruebas ejecutadas.</w:t>
       </w:r>
     </w:p>
-    <w:bookmarkEnd w:id="212"/>
-    <w:bookmarkStart w:id="213" w:name="evidencias-de-funcionamiento"/>
+    <w:bookmarkEnd w:id="213"/>
+    <w:bookmarkStart w:id="214" w:name="evidencias-de-funcionamiento"/>
     <w:p>
       <w:pPr>
         <w:pStyle w:val="Heading2"/>
@@ -25383,8 +25417,8 @@
         <w:t xml:space="preserve">Para la entrega final, las evidencias deben vincularse al mismo commit o release que se presenta. Si una evidencia corresponde a un ambiente de demo, se registra la fecha, usuario de prueba, proyecto usado y limitaciones conocidas.</w:t>
       </w:r>
     </w:p>
-    <w:bookmarkEnd w:id="213"/>
-    <w:bookmarkStart w:id="214" w:name="cierre-de-producto"/>
+    <w:bookmarkEnd w:id="214"/>
+    <w:bookmarkStart w:id="215" w:name="cierre-de-producto"/>
     <w:p>
       <w:pPr>
         <w:pStyle w:val="Heading2"/>
@@ -25469,9 +25503,9 @@
         <w:t xml:space="preserve">El producto final cumple la orientacion del proyecto: captura, analisis y entrega de resultados WiFi sin persistencia local de dominio en el dispositivo movil y con PostgreSQL como fuente central de verdad.</w:t>
       </w:r>
     </w:p>
-    <w:bookmarkEnd w:id="214"/>
     <w:bookmarkEnd w:id="215"/>
-    <w:bookmarkStart w:id="216" w:name="bibliografia"/>
+    <w:bookmarkEnd w:id="216"/>
+    <w:bookmarkStart w:id="217" w:name="bibliografia"/>
     <w:p>
       <w:pPr>
         <w:pStyle w:val="Heading1"/>
@@ -25795,8 +25829,8 @@
         <w:t xml:space="preserve">.</w:t>
       </w:r>
     </w:p>
-    <w:bookmarkEnd w:id="216"/>
-    <w:bookmarkStart w:id="222" w:name="anexos"/>
+    <w:bookmarkEnd w:id="217"/>
+    <w:bookmarkStart w:id="223" w:name="anexos"/>
     <w:p>
       <w:pPr>
         <w:pStyle w:val="Heading1"/>
@@ -25805,7 +25839,7 @@
         <w:t xml:space="preserve">Anexos</w:t>
       </w:r>
     </w:p>
-    <w:bookmarkStart w:id="217" w:name="anexo-a-codigos-qr"/>
+    <w:bookmarkStart w:id="218" w:name="anexo-a-codigos-qr"/>
     <w:p>
       <w:pPr>
         <w:pStyle w:val="Heading2"/>
@@ -25884,7 +25918,7 @@
               <w:pStyle w:val="Compact"/>
             </w:pPr>
             <w:r>
-              <w:t xml:space="preserve">Frontend publicado</w:t>
+              <w:t xml:space="preserve">Sitio empresarial Team 24 Software</w:t>
             </w:r>
           </w:p>
         </w:tc>
@@ -25908,6 +25942,78 @@
               <w:pStyle w:val="Compact"/>
             </w:pPr>
             <w:r>
+              <w:t xml:space="preserve">Facebook oficial Team 24 Software</w:t>
+            </w:r>
+          </w:p>
+        </w:tc>
+        <w:tc>
+          <w:tcPr/>
+          <w:p>
+            <w:pPr>
+              <w:pStyle w:val="Compact"/>
+            </w:pPr>
+            <w:r>
+              <w:t xml:space="preserve">https://www.facebook.com/profile.php?id=61591962512748</w:t>
+            </w:r>
+          </w:p>
+        </w:tc>
+      </w:tr>
+      <w:tr>
+        <w:tc>
+          <w:tcPr/>
+          <w:p>
+            <w:pPr>
+              <w:pStyle w:val="Compact"/>
+            </w:pPr>
+            <w:r>
+              <w:t xml:space="preserve">Panel administrador</w:t>
+            </w:r>
+          </w:p>
+        </w:tc>
+        <w:tc>
+          <w:tcPr/>
+          <w:p>
+            <w:pPr>
+              <w:pStyle w:val="Compact"/>
+            </w:pPr>
+            <w:r>
+              <w:t xml:space="preserve">https://wireless-heatmapper-g24.eastus2.cloudapp.azure.com/admin/login</w:t>
+            </w:r>
+          </w:p>
+        </w:tc>
+      </w:tr>
+      <w:tr>
+        <w:tc>
+          <w:tcPr/>
+          <w:p>
+            <w:pPr>
+              <w:pStyle w:val="Compact"/>
+            </w:pPr>
+            <w:r>
+              <w:t xml:space="preserve">Documentacion Swagger / OpenAPI</w:t>
+            </w:r>
+          </w:p>
+        </w:tc>
+        <w:tc>
+          <w:tcPr/>
+          <w:p>
+            <w:pPr>
+              <w:pStyle w:val="Compact"/>
+            </w:pPr>
+            <w:r>
+              <w:t xml:space="preserve">https://wireless-heatmapper-g24.eastus2.cloudapp.azure.com/api/docs</w:t>
+            </w:r>
+          </w:p>
+        </w:tc>
+      </w:tr>
+      <w:tr>
+        <w:tc>
+          <w:tcPr/>
+          <w:p>
+            <w:pPr>
+              <w:pStyle w:val="Compact"/>
+            </w:pPr>
+            <w:r>
               <w:t xml:space="preserve">Manual de usuario</w:t>
             </w:r>
           </w:p>
@@ -25949,8 +26055,8 @@
         </w:tc>
       </w:tr>
     </w:tbl>
-    <w:bookmarkEnd w:id="217"/>
-    <w:bookmarkStart w:id="218" w:name="anexo-b-glosario"/>
+    <w:bookmarkEnd w:id="218"/>
+    <w:bookmarkStart w:id="219" w:name="anexo-b-glosario"/>
     <w:p>
       <w:pPr>
         <w:pStyle w:val="Heading2"/>
@@ -26166,8 +26272,8 @@
         </w:tc>
       </w:tr>
     </w:tbl>
-    <w:bookmarkEnd w:id="218"/>
-    <w:bookmarkStart w:id="219" w:name="anexo-c-matriz-resumida-de-trazabilidad"/>
+    <w:bookmarkEnd w:id="219"/>
+    <w:bookmarkStart w:id="220" w:name="anexo-c-matriz-resumida-de-trazabilidad"/>
     <w:p>
       <w:pPr>
         <w:pStyle w:val="Heading2"/>
@@ -26561,8 +26667,8 @@
         </w:tc>
       </w:tr>
     </w:tbl>
-    <w:bookmarkEnd w:id="219"/>
-    <w:bookmarkStart w:id="220" w:name="anexo-d-lista-de-diagramas"/>
+    <w:bookmarkEnd w:id="220"/>
+    <w:bookmarkStart w:id="221" w:name="anexo-d-lista-de-diagramas"/>
     <w:p>
       <w:pPr>
         <w:pStyle w:val="Heading2"/>
@@ -26825,8 +26931,8 @@
         </w:tc>
       </w:tr>
     </w:tbl>
-    <w:bookmarkEnd w:id="220"/>
-    <w:bookmarkStart w:id="221" w:name="anexo-e-consolidacion-a-word"/>
+    <w:bookmarkEnd w:id="221"/>
+    <w:bookmarkStart w:id="222" w:name="anexo-e-consolidacion-a-word"/>
     <w:p>
       <w:pPr>
         <w:pStyle w:val="Heading2"/>
@@ -26843,9 +26949,9 @@
         <w:t xml:space="preserve">El documento Word se genera mediante el script de consolidacion incluido con esta entrega. Dicho script renderiza diagramas PlantUML, genera codigos QR, une los capitulos y produce el documento consolidado para Microsoft Word.</w:t>
       </w:r>
     </w:p>
-    <w:bookmarkEnd w:id="221"/>
     <w:bookmarkEnd w:id="222"/>
-    <w:bookmarkStart w:id="259" w:name="figuras-uml-renderizadas"/>
+    <w:bookmarkEnd w:id="223"/>
+    <w:bookmarkStart w:id="260" w:name="figuras-uml-renderizadas"/>
     <w:p>
       <w:pPr>
         <w:pStyle w:val="Heading1"/>
@@ -26854,7 +26960,7 @@
         <w:t xml:space="preserve">Figuras UML renderizadas</w:t>
       </w:r>
     </w:p>
-    <w:bookmarkStart w:id="226" w:name="modelo-contexto"/>
+    <w:bookmarkStart w:id="227" w:name="modelo-contexto"/>
     <w:p>
       <w:pPr>
         <w:pStyle w:val="Heading2"/>
@@ -26872,18 +26978,18 @@
           <wp:inline>
             <wp:extent cx="5334000" cy="6740453"/>
             <wp:effectExtent b="0" l="0" r="0" t="0"/>
-            <wp:docPr descr="modelo contexto" title="" id="224" name="Picture"/>
+            <wp:docPr descr="modelo contexto" title="" id="225" name="Picture"/>
             <a:graphic>
               <a:graphicData uri="http://schemas.openxmlformats.org/drawingml/2006/picture">
                 <pic:pic>
                   <pic:nvPicPr>
-                    <pic:cNvPr descr="/home/bquiroga/Documentos/dev/taller/proyecto-final/docs/SW2/assets/diagramas/01-modelo-contexto.png" id="225" name="Picture"/>
+                    <pic:cNvPr descr="/home/bquiroga/Documentos/dev/taller/proyecto-final/docs/SW2/assets/diagramas/01-modelo-contexto.png" id="226" name="Picture"/>
                     <pic:cNvPicPr>
                       <a:picLocks noChangeArrowheads="1" noChangeAspect="1"/>
                     </pic:cNvPicPr>
                   </pic:nvPicPr>
                   <pic:blipFill>
-                    <a:blip r:embed="rId223"/>
+                    <a:blip r:embed="rId224"/>
                     <a:stretch>
                       <a:fillRect/>
                     </a:stretch>
@@ -26918,8 +27024,8 @@
         <w:t xml:space="preserve">modelo contexto</w:t>
       </w:r>
     </w:p>
-    <w:bookmarkEnd w:id="226"/>
-    <w:bookmarkStart w:id="230" w:name="arquitectura-paquetes"/>
+    <w:bookmarkEnd w:id="227"/>
+    <w:bookmarkStart w:id="231" w:name="arquitectura-paquetes"/>
     <w:p>
       <w:pPr>
         <w:pStyle w:val="Heading2"/>
@@ -26937,18 +27043,18 @@
           <wp:inline>
             <wp:extent cx="5334000" cy="2096395"/>
             <wp:effectExtent b="0" l="0" r="0" t="0"/>
-            <wp:docPr descr="arquitectura paquetes" title="" id="228" name="Picture"/>
+            <wp:docPr descr="arquitectura paquetes" title="" id="229" name="Picture"/>
             <a:graphic>
               <a:graphicData uri="http://schemas.openxmlformats.org/drawingml/2006/picture">
                 <pic:pic>
                   <pic:nvPicPr>
-                    <pic:cNvPr descr="/home/bquiroga/Documentos/dev/taller/proyecto-final/docs/SW2/assets/diagramas/02-arquitectura-paquetes.png" id="229" name="Picture"/>
+                    <pic:cNvPr descr="/home/bquiroga/Documentos/dev/taller/proyecto-final/docs/SW2/assets/diagramas/02-arquitectura-paquetes.png" id="230" name="Picture"/>
                     <pic:cNvPicPr>
                       <a:picLocks noChangeArrowheads="1" noChangeAspect="1"/>
                     </pic:cNvPicPr>
                   </pic:nvPicPr>
                   <pic:blipFill>
-                    <a:blip r:embed="rId227"/>
+                    <a:blip r:embed="rId228"/>
                     <a:stretch>
                       <a:fillRect/>
                     </a:stretch>
@@ -26983,8 +27089,8 @@
         <w:t xml:space="preserve">arquitectura paquetes</w:t>
       </w:r>
     </w:p>
-    <w:bookmarkEnd w:id="230"/>
-    <w:bookmarkStart w:id="234" w:name="arquitectura-despliegue"/>
+    <w:bookmarkEnd w:id="231"/>
+    <w:bookmarkStart w:id="235" w:name="arquitectura-despliegue"/>
     <w:p>
       <w:pPr>
         <w:pStyle w:val="Heading2"/>
@@ -27002,18 +27108,18 @@
           <wp:inline>
             <wp:extent cx="5334000" cy="3183918"/>
             <wp:effectExtent b="0" l="0" r="0" t="0"/>
-            <wp:docPr descr="arquitectura despliegue" title="" id="232" name="Picture"/>
+            <wp:docPr descr="arquitectura despliegue" title="" id="233" name="Picture"/>
             <a:graphic>
               <a:graphicData uri="http://schemas.openxmlformats.org/drawingml/2006/picture">
                 <pic:pic>
                   <pic:nvPicPr>
-                    <pic:cNvPr descr="/home/bquiroga/Documentos/dev/taller/proyecto-final/docs/SW2/assets/diagramas/03-arquitectura-despliegue.png" id="233" name="Picture"/>
+                    <pic:cNvPr descr="/home/bquiroga/Documentos/dev/taller/proyecto-final/docs/SW2/assets/diagramas/03-arquitectura-despliegue.png" id="234" name="Picture"/>
                     <pic:cNvPicPr>
                       <a:picLocks noChangeArrowheads="1" noChangeAspect="1"/>
                     </pic:cNvPicPr>
                   </pic:nvPicPr>
                   <pic:blipFill>
-                    <a:blip r:embed="rId231"/>
+                    <a:blip r:embed="rId232"/>
                     <a:stretch>
                       <a:fillRect/>
                     </a:stretch>
@@ -27048,8 +27154,8 @@
         <w:t xml:space="preserve">arquitectura despliegue</w:t>
       </w:r>
     </w:p>
-    <w:bookmarkEnd w:id="234"/>
-    <w:bookmarkStart w:id="238" w:name="modelo-datos-conceptual"/>
+    <w:bookmarkEnd w:id="235"/>
+    <w:bookmarkStart w:id="239" w:name="modelo-datos-conceptual"/>
     <w:p>
       <w:pPr>
         <w:pStyle w:val="Heading2"/>
@@ -27067,18 +27173,18 @@
           <wp:inline>
             <wp:extent cx="5334000" cy="9218623"/>
             <wp:effectExtent b="0" l="0" r="0" t="0"/>
-            <wp:docPr descr="modelo datos conceptual" title="" id="236" name="Picture"/>
+            <wp:docPr descr="modelo datos conceptual" title="" id="237" name="Picture"/>
             <a:graphic>
               <a:graphicData uri="http://schemas.openxmlformats.org/drawingml/2006/picture">
                 <pic:pic>
                   <pic:nvPicPr>
-                    <pic:cNvPr descr="/home/bquiroga/Documentos/dev/taller/proyecto-final/docs/SW2/assets/diagramas/04-modelo-datos-conceptual.png" id="237" name="Picture"/>
+                    <pic:cNvPr descr="/home/bquiroga/Documentos/dev/taller/proyecto-final/docs/SW2/assets/diagramas/04-modelo-datos-conceptual.png" id="238" name="Picture"/>
                     <pic:cNvPicPr>
                       <a:picLocks noChangeArrowheads="1" noChangeAspect="1"/>
                     </pic:cNvPicPr>
                   </pic:nvPicPr>
                   <pic:blipFill>
-                    <a:blip r:embed="rId235"/>
+                    <a:blip r:embed="rId236"/>
                     <a:stretch>
                       <a:fillRect/>
                     </a:stretch>
@@ -27113,8 +27219,8 @@
         <w:t xml:space="preserve">modelo datos conceptual</w:t>
       </w:r>
     </w:p>
-    <w:bookmarkEnd w:id="238"/>
-    <w:bookmarkStart w:id="242" w:name="logica-captura-heatmap"/>
+    <w:bookmarkEnd w:id="239"/>
+    <w:bookmarkStart w:id="243" w:name="logica-captura-heatmap"/>
     <w:p>
       <w:pPr>
         <w:pStyle w:val="Heading2"/>
@@ -27132,18 +27238,18 @@
           <wp:inline>
             <wp:extent cx="5334000" cy="4677127"/>
             <wp:effectExtent b="0" l="0" r="0" t="0"/>
-            <wp:docPr descr="logica captura heatmap" title="" id="240" name="Picture"/>
+            <wp:docPr descr="logica captura heatmap" title="" id="241" name="Picture"/>
             <a:graphic>
               <a:graphicData uri="http://schemas.openxmlformats.org/drawingml/2006/picture">
                 <pic:pic>
                   <pic:nvPicPr>
-                    <pic:cNvPr descr="/home/bquiroga/Documentos/dev/taller/proyecto-final/docs/SW2/assets/diagramas/05-logica-captura-heatmap.png" id="241" name="Picture"/>
+                    <pic:cNvPr descr="/home/bquiroga/Documentos/dev/taller/proyecto-final/docs/SW2/assets/diagramas/05-logica-captura-heatmap.png" id="242" name="Picture"/>
                     <pic:cNvPicPr>
                       <a:picLocks noChangeArrowheads="1" noChangeAspect="1"/>
                     </pic:cNvPicPr>
                   </pic:nvPicPr>
                   <pic:blipFill>
-                    <a:blip r:embed="rId239"/>
+                    <a:blip r:embed="rId240"/>
                     <a:stretch>
                       <a:fillRect/>
                     </a:stretch>
@@ -27178,8 +27284,8 @@
         <w:t xml:space="preserve">logica captura heatmap</w:t>
       </w:r>
     </w:p>
-    <w:bookmarkEnd w:id="242"/>
-    <w:bookmarkStart w:id="246" w:name="logica-portal-cliente"/>
+    <w:bookmarkEnd w:id="243"/>
+    <w:bookmarkStart w:id="247" w:name="logica-portal-cliente"/>
     <w:p>
       <w:pPr>
         <w:pStyle w:val="Heading2"/>
@@ -27197,18 +27303,18 @@
           <wp:inline>
             <wp:extent cx="5334000" cy="4084898"/>
             <wp:effectExtent b="0" l="0" r="0" t="0"/>
-            <wp:docPr descr="logica portal cliente" title="" id="244" name="Picture"/>
+            <wp:docPr descr="logica portal cliente" title="" id="245" name="Picture"/>
             <a:graphic>
               <a:graphicData uri="http://schemas.openxmlformats.org/drawingml/2006/picture">
                 <pic:pic>
                   <pic:nvPicPr>
-                    <pic:cNvPr descr="/home/bquiroga/Documentos/dev/taller/proyecto-final/docs/SW2/assets/diagramas/06-logica-portal-cliente.png" id="245" name="Picture"/>
+                    <pic:cNvPr descr="/home/bquiroga/Documentos/dev/taller/proyecto-final/docs/SW2/assets/diagramas/06-logica-portal-cliente.png" id="246" name="Picture"/>
                     <pic:cNvPicPr>
                       <a:picLocks noChangeArrowheads="1" noChangeAspect="1"/>
                     </pic:cNvPicPr>
                   </pic:nvPicPr>
                   <pic:blipFill>
-                    <a:blip r:embed="rId243"/>
+                    <a:blip r:embed="rId244"/>
                     <a:stretch>
                       <a:fillRect/>
                     </a:stretch>
@@ -27243,8 +27349,8 @@
         <w:t xml:space="preserve">logica portal cliente</w:t>
       </w:r>
     </w:p>
-    <w:bookmarkEnd w:id="246"/>
-    <w:bookmarkStart w:id="250" w:name="estados-proyecto"/>
+    <w:bookmarkEnd w:id="247"/>
+    <w:bookmarkStart w:id="251" w:name="estados-proyecto"/>
     <w:p>
       <w:pPr>
         <w:pStyle w:val="Heading2"/>
@@ -27262,18 +27368,18 @@
           <wp:inline>
             <wp:extent cx="5334000" cy="3243648"/>
             <wp:effectExtent b="0" l="0" r="0" t="0"/>
-            <wp:docPr descr="estados proyecto" title="" id="248" name="Picture"/>
+            <wp:docPr descr="estados proyecto" title="" id="249" name="Picture"/>
             <a:graphic>
               <a:graphicData uri="http://schemas.openxmlformats.org/drawingml/2006/picture">
                 <pic:pic>
                   <pic:nvPicPr>
-                    <pic:cNvPr descr="/home/bquiroga/Documentos/dev/taller/proyecto-final/docs/SW2/assets/diagramas/07-estados-proyecto.png" id="249" name="Picture"/>
+                    <pic:cNvPr descr="/home/bquiroga/Documentos/dev/taller/proyecto-final/docs/SW2/assets/diagramas/07-estados-proyecto.png" id="250" name="Picture"/>
                     <pic:cNvPicPr>
                       <a:picLocks noChangeArrowheads="1" noChangeAspect="1"/>
                     </pic:cNvPicPr>
                   </pic:nvPicPr>
                   <pic:blipFill>
-                    <a:blip r:embed="rId247"/>
+                    <a:blip r:embed="rId248"/>
                     <a:stretch>
                       <a:fillRect/>
                     </a:stretch>
@@ -27308,8 +27414,8 @@
         <w:t xml:space="preserve">estados proyecto</w:t>
       </w:r>
     </w:p>
-    <w:bookmarkEnd w:id="250"/>
-    <w:bookmarkStart w:id="254" w:name="case-navegabilidad"/>
+    <w:bookmarkEnd w:id="251"/>
+    <w:bookmarkStart w:id="255" w:name="case-navegabilidad"/>
     <w:p>
       <w:pPr>
         <w:pStyle w:val="Heading2"/>
@@ -27327,18 +27433,18 @@
           <wp:inline>
             <wp:extent cx="5334000" cy="953224"/>
             <wp:effectExtent b="0" l="0" r="0" t="0"/>
-            <wp:docPr descr="case navegabilidad" title="" id="252" name="Picture"/>
+            <wp:docPr descr="case navegabilidad" title="" id="253" name="Picture"/>
             <a:graphic>
               <a:graphicData uri="http://schemas.openxmlformats.org/drawingml/2006/picture">
                 <pic:pic>
                   <pic:nvPicPr>
-                    <pic:cNvPr descr="/home/bquiroga/Documentos/dev/taller/proyecto-final/docs/SW2/assets/diagramas/08-case-navegabilidad.png" id="253" name="Picture"/>
+                    <pic:cNvPr descr="/home/bquiroga/Documentos/dev/taller/proyecto-final/docs/SW2/assets/diagramas/08-case-navegabilidad.png" id="254" name="Picture"/>
                     <pic:cNvPicPr>
                       <a:picLocks noChangeArrowheads="1" noChangeAspect="1"/>
                     </pic:cNvPicPr>
                   </pic:nvPicPr>
                   <pic:blipFill>
-                    <a:blip r:embed="rId251"/>
+                    <a:blip r:embed="rId252"/>
                     <a:stretch>
                       <a:fillRect/>
                     </a:stretch>
@@ -27373,8 +27479,8 @@
         <w:t xml:space="preserve">case navegabilidad</w:t>
       </w:r>
     </w:p>
-    <w:bookmarkEnd w:id="254"/>
-    <w:bookmarkStart w:id="258" w:name="flujo-pruebas-rup"/>
+    <w:bookmarkEnd w:id="255"/>
+    <w:bookmarkStart w:id="259" w:name="flujo-pruebas-rup"/>
     <w:p>
       <w:pPr>
         <w:pStyle w:val="Heading2"/>
@@ -27392,18 +27498,18 @@
           <wp:inline>
             <wp:extent cx="5194300" cy="15468600"/>
             <wp:effectExtent b="0" l="0" r="0" t="0"/>
-            <wp:docPr descr="flujo pruebas rup" title="" id="256" name="Picture"/>
+            <wp:docPr descr="flujo pruebas rup" title="" id="257" name="Picture"/>
             <a:graphic>
               <a:graphicData uri="http://schemas.openxmlformats.org/drawingml/2006/picture">
                 <pic:pic>
                   <pic:nvPicPr>
-                    <pic:cNvPr descr="/home/bquiroga/Documentos/dev/taller/proyecto-final/docs/SW2/assets/diagramas/09-flujo-pruebas-rup.png" id="257" name="Picture"/>
+                    <pic:cNvPr descr="/home/bquiroga/Documentos/dev/taller/proyecto-final/docs/SW2/assets/diagramas/09-flujo-pruebas-rup.png" id="258" name="Picture"/>
                     <pic:cNvPicPr>
                       <a:picLocks noChangeArrowheads="1" noChangeAspect="1"/>
                     </pic:cNvPicPr>
                   </pic:nvPicPr>
                   <pic:blipFill>
-                    <a:blip r:embed="rId255"/>
+                    <a:blip r:embed="rId256"/>
                     <a:stretch>
                       <a:fillRect/>
                     </a:stretch>
@@ -27438,9 +27544,9 @@
         <w:t xml:space="preserve">flujo pruebas rup</w:t>
       </w:r>
     </w:p>
-    <w:bookmarkEnd w:id="258"/>
     <w:bookmarkEnd w:id="259"/>
-    <w:bookmarkStart w:id="276" w:name="codigos-qr"/>
+    <w:bookmarkEnd w:id="260"/>
+    <w:bookmarkStart w:id="285" w:name="codigos-qr"/>
     <w:p>
       <w:pPr>
         <w:pStyle w:val="Heading1"/>
@@ -27449,7 +27555,7 @@
         <w:t xml:space="preserve">Codigos QR</w:t>
       </w:r>
     </w:p>
-    <w:bookmarkStart w:id="263" w:name="repositorio-github"/>
+    <w:bookmarkStart w:id="264" w:name="repositorio-github"/>
     <w:p>
       <w:pPr>
         <w:pStyle w:val="Heading2"/>
@@ -27462,7 +27568,7 @@
       <w:pPr>
         <w:pStyle w:val="FirstParagraph"/>
       </w:pPr>
-      <w:hyperlink r:id="rId194">
+      <w:hyperlink r:id="rId195">
         <w:r>
           <w:rPr>
             <w:rStyle w:val="Hyperlink"/>
@@ -27480,18 +27586,18 @@
           <wp:inline>
             <wp:extent cx="5207000" cy="5207000"/>
             <wp:effectExtent b="0" l="0" r="0" t="0"/>
-            <wp:docPr descr="QR repositorio" title="" id="261" name="Picture"/>
+            <wp:docPr descr="QR repositorio" title="" id="262" name="Picture"/>
             <a:graphic>
               <a:graphicData uri="http://schemas.openxmlformats.org/drawingml/2006/picture">
                 <pic:pic>
                   <pic:nvPicPr>
-                    <pic:cNvPr descr="/home/bquiroga/Documentos/dev/taller/proyecto-final/docs/SW2/assets/qr-repositorio.png" id="262" name="Picture"/>
+                    <pic:cNvPr descr="/home/bquiroga/Documentos/dev/taller/proyecto-final/docs/SW2/assets/qr-repositorio.png" id="263" name="Picture"/>
                     <pic:cNvPicPr>
                       <a:picLocks noChangeArrowheads="1" noChangeAspect="1"/>
                     </pic:cNvPicPr>
                   </pic:nvPicPr>
                   <pic:blipFill>
-                    <a:blip r:embed="rId260"/>
+                    <a:blip r:embed="rId261"/>
                     <a:stretch>
                       <a:fillRect/>
                     </a:stretch>
@@ -27526,14 +27632,14 @@
         <w:t xml:space="preserve">QR repositorio</w:t>
       </w:r>
     </w:p>
-    <w:bookmarkEnd w:id="263"/>
-    <w:bookmarkStart w:id="267" w:name="frontend-publicado"/>
+    <w:bookmarkEnd w:id="264"/>
+    <w:bookmarkStart w:id="268" w:name="sitio-empresarial-team-24-software"/>
     <w:p>
       <w:pPr>
         <w:pStyle w:val="Heading2"/>
       </w:pPr>
       <w:r>
-        <w:t xml:space="preserve">Frontend publicado</w:t>
+        <w:t xml:space="preserve">Sitio empresarial Team 24 Software</w:t>
       </w:r>
     </w:p>
     <w:p>
@@ -27558,18 +27664,18 @@
           <wp:inline>
             <wp:extent cx="5207000" cy="5207000"/>
             <wp:effectExtent b="0" l="0" r="0" t="0"/>
-            <wp:docPr descr="QR frontend" title="" id="265" name="Picture"/>
+            <wp:docPr descr="QR sitio empresarial" title="" id="266" name="Picture"/>
             <a:graphic>
               <a:graphicData uri="http://schemas.openxmlformats.org/drawingml/2006/picture">
                 <pic:pic>
                   <pic:nvPicPr>
-                    <pic:cNvPr descr="/home/bquiroga/Documentos/dev/taller/proyecto-final/docs/SW2/assets/qr-frontend.png" id="266" name="Picture"/>
+                    <pic:cNvPr descr="/home/bquiroga/Documentos/dev/taller/proyecto-final/docs/SW2/assets/qr-sitio-empresa.png" id="267" name="Picture"/>
                     <pic:cNvPicPr>
                       <a:picLocks noChangeArrowheads="1" noChangeAspect="1"/>
                     </pic:cNvPicPr>
                   </pic:nvPicPr>
                   <pic:blipFill>
-                    <a:blip r:embed="rId264"/>
+                    <a:blip r:embed="rId265"/>
                     <a:stretch>
                       <a:fillRect/>
                     </a:stretch>
@@ -27601,29 +27707,29 @@
         <w:pStyle w:val="ImageCaption"/>
       </w:pPr>
       <w:r>
-        <w:t xml:space="preserve">QR frontend</w:t>
-      </w:r>
-    </w:p>
-    <w:bookmarkEnd w:id="267"/>
-    <w:bookmarkStart w:id="271" w:name="manual-de-usuario"/>
+        <w:t xml:space="preserve">QR sitio empresarial</w:t>
+      </w:r>
+    </w:p>
+    <w:bookmarkEnd w:id="268"/>
+    <w:bookmarkStart w:id="272" w:name="facebook-oficial-team-24-software"/>
     <w:p>
       <w:pPr>
         <w:pStyle w:val="Heading2"/>
       </w:pPr>
       <w:r>
-        <w:t xml:space="preserve">Manual de usuario</w:t>
+        <w:t xml:space="preserve">Facebook oficial Team 24 Software</w:t>
       </w:r>
     </w:p>
     <w:p>
       <w:pPr>
         <w:pStyle w:val="FirstParagraph"/>
       </w:pPr>
-      <w:hyperlink r:id="rId199">
+      <w:hyperlink r:id="rId117">
         <w:r>
           <w:rPr>
             <w:rStyle w:val="Hyperlink"/>
           </w:rPr>
-          <w:t xml:space="preserve">https://wireless-heatmapper-g24.eastus2.cloudapp.azure.com/manual/</w:t>
+          <w:t xml:space="preserve">https://www.facebook.com/profile.php?id=61591962512748</w:t>
         </w:r>
       </w:hyperlink>
     </w:p>
@@ -27634,20 +27740,98 @@
       <w:r>
         <w:drawing>
           <wp:inline>
-            <wp:extent cx="5334000" cy="5334000"/>
+            <wp:extent cx="5207000" cy="5207000"/>
             <wp:effectExtent b="0" l="0" r="0" t="0"/>
-            <wp:docPr descr="QR manual" title="" id="269" name="Picture"/>
+            <wp:docPr descr="QR Facebook oficial" title="" id="270" name="Picture"/>
             <a:graphic>
               <a:graphicData uri="http://schemas.openxmlformats.org/drawingml/2006/picture">
                 <pic:pic>
                   <pic:nvPicPr>
-                    <pic:cNvPr descr="/home/bquiroga/Documentos/dev/taller/proyecto-final/docs/SW2/assets/qr-manual.png" id="270" name="Picture"/>
+                    <pic:cNvPr descr="/home/bquiroga/Documentos/dev/taller/proyecto-final/docs/SW2/assets/qr-facebook.png" id="271" name="Picture"/>
                     <pic:cNvPicPr>
                       <a:picLocks noChangeArrowheads="1" noChangeAspect="1"/>
                     </pic:cNvPicPr>
                   </pic:nvPicPr>
                   <pic:blipFill>
-                    <a:blip r:embed="rId268"/>
+                    <a:blip r:embed="rId269"/>
+                    <a:stretch>
+                      <a:fillRect/>
+                    </a:stretch>
+                  </pic:blipFill>
+                  <pic:spPr bwMode="auto">
+                    <a:xfrm>
+                      <a:off x="0" y="0"/>
+                      <a:ext cx="5207000" cy="5207000"/>
+                    </a:xfrm>
+                    <a:prstGeom prst="rect">
+                      <a:avLst/>
+                    </a:prstGeom>
+                    <a:noFill/>
+                    <a:ln w="9525">
+                      <a:noFill/>
+                      <a:headEnd/>
+                      <a:tailEnd/>
+                    </a:ln>
+                  </pic:spPr>
+                </pic:pic>
+              </a:graphicData>
+            </a:graphic>
+          </wp:inline>
+        </w:drawing>
+      </w:r>
+    </w:p>
+    <w:p>
+      <w:pPr>
+        <w:pStyle w:val="ImageCaption"/>
+      </w:pPr>
+      <w:r>
+        <w:t xml:space="preserve">QR Facebook oficial</w:t>
+      </w:r>
+    </w:p>
+    <w:bookmarkEnd w:id="272"/>
+    <w:bookmarkStart w:id="276" w:name="documentacion-swagger-openapi"/>
+    <w:p>
+      <w:pPr>
+        <w:pStyle w:val="Heading2"/>
+      </w:pPr>
+      <w:r>
+        <w:t xml:space="preserve">Documentacion Swagger / OpenAPI</w:t>
+      </w:r>
+    </w:p>
+    <w:p>
+      <w:pPr>
+        <w:pStyle w:val="FirstParagraph"/>
+      </w:pPr>
+      <w:hyperlink r:id="rId198">
+        <w:r>
+          <w:rPr>
+            <w:rStyle w:val="Hyperlink"/>
+          </w:rPr>
+          <w:t xml:space="preserve">https://wireless-heatmapper-g24.eastus2.cloudapp.azure.com/api/docs</w:t>
+        </w:r>
+      </w:hyperlink>
+    </w:p>
+    <w:p>
+      <w:pPr>
+        <w:pStyle w:val="CaptionedFigure"/>
+      </w:pPr>
+      <w:r>
+        <w:drawing>
+          <wp:inline>
+            <wp:extent cx="5334000" cy="5334000"/>
+            <wp:effectExtent b="0" l="0" r="0" t="0"/>
+            <wp:docPr descr="QR documentacion API" title="" id="274" name="Picture"/>
+            <a:graphic>
+              <a:graphicData uri="http://schemas.openxmlformats.org/drawingml/2006/picture">
+                <pic:pic>
+                  <pic:nvPicPr>
+                    <pic:cNvPr descr="/home/bquiroga/Documentos/dev/taller/proyecto-final/docs/SW2/assets/qr-api-docs.png" id="275" name="Picture"/>
+                    <pic:cNvPicPr>
+                      <a:picLocks noChangeArrowheads="1" noChangeAspect="1"/>
+                    </pic:cNvPicPr>
+                  </pic:nvPicPr>
+                  <pic:blipFill>
+                    <a:blip r:embed="rId273"/>
                     <a:stretch>
                       <a:fillRect/>
                     </a:stretch>
@@ -27679,11 +27863,89 @@
         <w:pStyle w:val="ImageCaption"/>
       </w:pPr>
       <w:r>
+        <w:t xml:space="preserve">QR documentacion API</w:t>
+      </w:r>
+    </w:p>
+    <w:bookmarkEnd w:id="276"/>
+    <w:bookmarkStart w:id="280" w:name="manual-de-usuario"/>
+    <w:p>
+      <w:pPr>
+        <w:pStyle w:val="Heading2"/>
+      </w:pPr>
+      <w:r>
+        <w:t xml:space="preserve">Manual de usuario</w:t>
+      </w:r>
+    </w:p>
+    <w:p>
+      <w:pPr>
+        <w:pStyle w:val="FirstParagraph"/>
+      </w:pPr>
+      <w:hyperlink r:id="rId200">
+        <w:r>
+          <w:rPr>
+            <w:rStyle w:val="Hyperlink"/>
+          </w:rPr>
+          <w:t xml:space="preserve">https://wireless-heatmapper-g24.eastus2.cloudapp.azure.com/manual/</w:t>
+        </w:r>
+      </w:hyperlink>
+    </w:p>
+    <w:p>
+      <w:pPr>
+        <w:pStyle w:val="CaptionedFigure"/>
+      </w:pPr>
+      <w:r>
+        <w:drawing>
+          <wp:inline>
+            <wp:extent cx="5334000" cy="5334000"/>
+            <wp:effectExtent b="0" l="0" r="0" t="0"/>
+            <wp:docPr descr="QR manual" title="" id="278" name="Picture"/>
+            <a:graphic>
+              <a:graphicData uri="http://schemas.openxmlformats.org/drawingml/2006/picture">
+                <pic:pic>
+                  <pic:nvPicPr>
+                    <pic:cNvPr descr="/home/bquiroga/Documentos/dev/taller/proyecto-final/docs/SW2/assets/qr-manual.png" id="279" name="Picture"/>
+                    <pic:cNvPicPr>
+                      <a:picLocks noChangeArrowheads="1" noChangeAspect="1"/>
+                    </pic:cNvPicPr>
+                  </pic:nvPicPr>
+                  <pic:blipFill>
+                    <a:blip r:embed="rId277"/>
+                    <a:stretch>
+                      <a:fillRect/>
+                    </a:stretch>
+                  </pic:blipFill>
+                  <pic:spPr bwMode="auto">
+                    <a:xfrm>
+                      <a:off x="0" y="0"/>
+                      <a:ext cx="5334000" cy="5334000"/>
+                    </a:xfrm>
+                    <a:prstGeom prst="rect">
+                      <a:avLst/>
+                    </a:prstGeom>
+                    <a:noFill/>
+                    <a:ln w="9525">
+                      <a:noFill/>
+                      <a:headEnd/>
+                      <a:tailEnd/>
+                    </a:ln>
+                  </pic:spPr>
+                </pic:pic>
+              </a:graphicData>
+            </a:graphic>
+          </wp:inline>
+        </w:drawing>
+      </w:r>
+    </w:p>
+    <w:p>
+      <w:pPr>
+        <w:pStyle w:val="ImageCaption"/>
+      </w:pPr>
+      <w:r>
         <w:t xml:space="preserve">QR manual</w:t>
       </w:r>
     </w:p>
-    <w:bookmarkEnd w:id="271"/>
-    <w:bookmarkStart w:id="275" w:name="releases-moviles-1"/>
+    <w:bookmarkEnd w:id="280"/>
+    <w:bookmarkStart w:id="284" w:name="releases-moviles-1"/>
     <w:p>
       <w:pPr>
         <w:pStyle w:val="Heading2"/>
@@ -27696,7 +27958,7 @@
       <w:pPr>
         <w:pStyle w:val="FirstParagraph"/>
       </w:pPr>
-      <w:hyperlink r:id="rId200">
+      <w:hyperlink r:id="rId201">
         <w:r>
           <w:rPr>
             <w:rStyle w:val="Hyperlink"/>
@@ -27714,18 +27976,18 @@
           <wp:inline>
             <wp:extent cx="5207000" cy="5207000"/>
             <wp:effectExtent b="0" l="0" r="0" t="0"/>
-            <wp:docPr descr="QR releases" title="" id="273" name="Picture"/>
+            <wp:docPr descr="QR releases" title="" id="282" name="Picture"/>
             <a:graphic>
               <a:graphicData uri="http://schemas.openxmlformats.org/drawingml/2006/picture">
                 <pic:pic>
                   <pic:nvPicPr>
-                    <pic:cNvPr descr="/home/bquiroga/Documentos/dev/taller/proyecto-final/docs/SW2/assets/qr-releases.png" id="274" name="Picture"/>
+                    <pic:cNvPr descr="/home/bquiroga/Documentos/dev/taller/proyecto-final/docs/SW2/assets/qr-releases.png" id="283" name="Picture"/>
                     <pic:cNvPicPr>
                       <a:picLocks noChangeArrowheads="1" noChangeAspect="1"/>
                     </pic:cNvPicPr>
                   </pic:nvPicPr>
                   <pic:blipFill>
-                    <a:blip r:embed="rId272"/>
+                    <a:blip r:embed="rId281"/>
                     <a:stretch>
                       <a:fillRect/>
                     </a:stretch>
@@ -27760,8 +28022,8 @@
         <w:t xml:space="preserve">QR releases</w:t>
       </w:r>
     </w:p>
-    <w:bookmarkEnd w:id="275"/>
-    <w:bookmarkEnd w:id="276"/>
+    <w:bookmarkEnd w:id="284"/>
+    <w:bookmarkEnd w:id="285"/>
     <w:sectPr>
       <w:footnotePr>
         <w:numRestart w:val="eachSect"/>

</xml_diff>

<commit_message>
fix(sw2): convertir metricas PAPS a tablas Word
</commit_message>
<xml_diff>
--- a/docs/SW2/build/WirelessHeatMapper-SW2-Consolidado.docx
+++ b/docs/SW2/build/WirelessHeatMapper-SW2-Consolidado.docx
@@ -1173,157 +1173,284 @@
         <w:t xml:space="preserve">728 bifurcaciones en GitHub.</w:t>
       </w:r>
     </w:p>
-    <w:p>
-      <w:r>
-        <w:pict>
-          <v:rect style="width:0;height:1.5pt" o:hralign="center" o:hrstd="t" o:hr="t"/>
-        </w:pict>
-      </w:r>
-    </w:p>
-    <w:p>
-      <w:pPr>
-        <w:pStyle w:val="SourceCode"/>
-      </w:pPr>
-      <w:r>
-        <w:rPr>
-          <w:rStyle w:val="VerbatimChar"/>
-        </w:rPr>
-        <w:t xml:space="preserve">         **Atributo**                                 **Valor**</w:t>
-      </w:r>
-    </w:p>
-    <w:p>
-      <w:r>
-        <w:pict>
-          <v:rect style="width:0;height:1.5pt" o:hralign="center" o:hrstd="t" o:hr="t"/>
-        </w:pict>
-      </w:r>
-    </w:p>
-    <w:p>
-      <w:pPr>
-        <w:pStyle w:val="SourceCode"/>
-      </w:pPr>
-      <w:r>
-        <w:rPr>
-          <w:rStyle w:val="VerbatimChar"/>
-        </w:rPr>
-        <w:t xml:space="preserve">          Repositorio              github.com/VREMSoftwareDevelopment/WiFiAnalyzer</w:t>
-      </w:r>
-      <w:r>
-        <w:br/>
-      </w:r>
-      <w:r>
-        <w:br/>
-      </w:r>
-      <w:r>
-        <w:rPr>
-          <w:rStyle w:val="VerbatimChar"/>
-        </w:rPr>
-        <w:t xml:space="preserve">          Plataforma                       Android (Google Play / F-Droid)</w:t>
-      </w:r>
-      <w:r>
-        <w:br/>
-      </w:r>
-      <w:r>
-        <w:br/>
-      </w:r>
-      <w:r>
-        <w:rPr>
-          <w:rStyle w:val="VerbatimChar"/>
-        </w:rPr>
-        <w:t xml:space="preserve">      Lenguaje principal                      Kotlin 97.4 %, Java 2.6 %</w:t>
-      </w:r>
-      <w:r>
-        <w:br/>
-      </w:r>
-      <w:r>
-        <w:br/>
-      </w:r>
-      <w:r>
-        <w:rPr>
-          <w:rStyle w:val="VerbatimChar"/>
-        </w:rPr>
-        <w:t xml:space="preserve">           Licencia                                    GPL-3.0</w:t>
-      </w:r>
-      <w:r>
-        <w:br/>
-      </w:r>
-      <w:r>
-        <w:br/>
-      </w:r>
-      <w:r>
-        <w:rPr>
-          <w:rStyle w:val="VerbatimChar"/>
-        </w:rPr>
-        <w:t xml:space="preserve">       Estrellas GitHub                                 4 700</w:t>
-      </w:r>
-      <w:r>
-        <w:br/>
-      </w:r>
-      <w:r>
-        <w:br/>
-      </w:r>
-      <w:r>
-        <w:rPr>
-          <w:rStyle w:val="VerbatimChar"/>
-        </w:rPr>
-        <w:t xml:space="preserve">         Bifurcaciones                                   728</w:t>
-      </w:r>
-      <w:r>
-        <w:br/>
-      </w:r>
-      <w:r>
-        <w:br/>
-      </w:r>
-      <w:r>
-        <w:rPr>
-          <w:rStyle w:val="VerbatimChar"/>
-        </w:rPr>
-        <w:t xml:space="preserve">   Confirmaciones (commits)                             2 013</w:t>
-      </w:r>
-      <w:r>
-        <w:br/>
-      </w:r>
-      <w:r>
-        <w:br/>
-      </w:r>
-      <w:r>
-        <w:rPr>
-          <w:rStyle w:val="VerbatimChar"/>
-        </w:rPr>
-        <w:t xml:space="preserve"> Incidencias abiertas (issues)                            6</w:t>
-      </w:r>
-      <w:r>
-        <w:br/>
-      </w:r>
-      <w:r>
-        <w:br/>
-      </w:r>
-      <w:r>
-        <w:rPr>
-          <w:rStyle w:val="VerbatimChar"/>
-        </w:rPr>
-        <w:t xml:space="preserve">         KLDC estimado                                  25.0</w:t>
-      </w:r>
-      <w:r>
-        <w:br/>
-      </w:r>
-      <w:r>
-        <w:br/>
-      </w:r>
-      <w:r>
-        <w:rPr>
-          <w:rStyle w:val="VerbatimChar"/>
-        </w:rPr>
-        <w:t xml:space="preserve">       Esfuerzo estimado                           71 personas-mes</w:t>
-      </w:r>
-    </w:p>
-    <w:p>
-      <w:r>
-        <w:pict>
-          <v:rect style="width:0;height:1.5pt" o:hralign="center" o:hrstd="t" o:hr="t"/>
-        </w:pict>
-      </w:r>
-    </w:p>
+    <w:tbl>
+      <w:tblPr>
+        <w:tblStyle w:val="Table"/>
+        <w:tblW w:type="auto" w:w="0"/>
+        <w:tblLook w:firstRow="1" w:lastRow="0" w:firstColumn="0" w:lastColumn="0" w:noHBand="0" w:noVBand="0" w:val="0020"/>
+      </w:tblPr>
+      <w:tblGrid>
+        <w:gridCol w:w="3960"/>
+        <w:gridCol w:w="3960"/>
+      </w:tblGrid>
+      <w:tr>
+        <w:trPr>
+          <w:tblHeader w:val="on"/>
+        </w:trPr>
+        <w:tc>
+          <w:tcPr/>
+          <w:p>
+            <w:pPr>
+              <w:pStyle w:val="Compact"/>
+            </w:pPr>
+            <w:r>
+              <w:t xml:space="preserve">Atributo</w:t>
+            </w:r>
+          </w:p>
+        </w:tc>
+        <w:tc>
+          <w:tcPr/>
+          <w:p>
+            <w:pPr>
+              <w:pStyle w:val="Compact"/>
+            </w:pPr>
+            <w:r>
+              <w:t xml:space="preserve">Valor</w:t>
+            </w:r>
+          </w:p>
+        </w:tc>
+      </w:tr>
+      <w:tr>
+        <w:tc>
+          <w:tcPr/>
+          <w:p>
+            <w:pPr>
+              <w:pStyle w:val="Compact"/>
+            </w:pPr>
+            <w:r>
+              <w:t xml:space="preserve">Repositorio</w:t>
+            </w:r>
+          </w:p>
+        </w:tc>
+        <w:tc>
+          <w:tcPr/>
+          <w:p>
+            <w:pPr>
+              <w:pStyle w:val="Compact"/>
+            </w:pPr>
+            <w:r>
+              <w:t xml:space="preserve">github.com/VREMSoftwareDevelopment/WiFiAnalyzer</w:t>
+            </w:r>
+          </w:p>
+        </w:tc>
+      </w:tr>
+      <w:tr>
+        <w:tc>
+          <w:tcPr/>
+          <w:p>
+            <w:pPr>
+              <w:pStyle w:val="Compact"/>
+            </w:pPr>
+            <w:r>
+              <w:t xml:space="preserve">Plataforma</w:t>
+            </w:r>
+          </w:p>
+        </w:tc>
+        <w:tc>
+          <w:tcPr/>
+          <w:p>
+            <w:pPr>
+              <w:pStyle w:val="Compact"/>
+            </w:pPr>
+            <w:r>
+              <w:t xml:space="preserve">Android (Google Play / F-Droid)</w:t>
+            </w:r>
+          </w:p>
+        </w:tc>
+      </w:tr>
+      <w:tr>
+        <w:tc>
+          <w:tcPr/>
+          <w:p>
+            <w:pPr>
+              <w:pStyle w:val="Compact"/>
+            </w:pPr>
+            <w:r>
+              <w:t xml:space="preserve">Lenguaje principal</w:t>
+            </w:r>
+          </w:p>
+        </w:tc>
+        <w:tc>
+          <w:tcPr/>
+          <w:p>
+            <w:pPr>
+              <w:pStyle w:val="Compact"/>
+            </w:pPr>
+            <w:r>
+              <w:t xml:space="preserve">Kotlin 97.4 %, Java 2.6 %</w:t>
+            </w:r>
+          </w:p>
+        </w:tc>
+      </w:tr>
+      <w:tr>
+        <w:tc>
+          <w:tcPr/>
+          <w:p>
+            <w:pPr>
+              <w:pStyle w:val="Compact"/>
+            </w:pPr>
+            <w:r>
+              <w:t xml:space="preserve">Licencia</w:t>
+            </w:r>
+          </w:p>
+        </w:tc>
+        <w:tc>
+          <w:tcPr/>
+          <w:p>
+            <w:pPr>
+              <w:pStyle w:val="Compact"/>
+            </w:pPr>
+            <w:r>
+              <w:t xml:space="preserve">GPL-3.0</w:t>
+            </w:r>
+          </w:p>
+        </w:tc>
+      </w:tr>
+      <w:tr>
+        <w:tc>
+          <w:tcPr/>
+          <w:p>
+            <w:pPr>
+              <w:pStyle w:val="Compact"/>
+            </w:pPr>
+            <w:r>
+              <w:t xml:space="preserve">Estrellas GitHub</w:t>
+            </w:r>
+          </w:p>
+        </w:tc>
+        <w:tc>
+          <w:tcPr/>
+          <w:p>
+            <w:pPr>
+              <w:pStyle w:val="Compact"/>
+            </w:pPr>
+            <w:r>
+              <w:t xml:space="preserve">4 700</w:t>
+            </w:r>
+          </w:p>
+        </w:tc>
+      </w:tr>
+      <w:tr>
+        <w:tc>
+          <w:tcPr/>
+          <w:p>
+            <w:pPr>
+              <w:pStyle w:val="Compact"/>
+            </w:pPr>
+            <w:r>
+              <w:t xml:space="preserve">Bifurcaciones</w:t>
+            </w:r>
+          </w:p>
+        </w:tc>
+        <w:tc>
+          <w:tcPr/>
+          <w:p>
+            <w:pPr>
+              <w:pStyle w:val="Compact"/>
+            </w:pPr>
+            <w:r>
+              <w:t xml:space="preserve">728</w:t>
+            </w:r>
+          </w:p>
+        </w:tc>
+      </w:tr>
+      <w:tr>
+        <w:tc>
+          <w:tcPr/>
+          <w:p>
+            <w:pPr>
+              <w:pStyle w:val="Compact"/>
+            </w:pPr>
+            <w:r>
+              <w:t xml:space="preserve">Confirmaciones (commits)</w:t>
+            </w:r>
+          </w:p>
+        </w:tc>
+        <w:tc>
+          <w:tcPr/>
+          <w:p>
+            <w:pPr>
+              <w:pStyle w:val="Compact"/>
+            </w:pPr>
+            <w:r>
+              <w:t xml:space="preserve">2 013</w:t>
+            </w:r>
+          </w:p>
+        </w:tc>
+      </w:tr>
+      <w:tr>
+        <w:tc>
+          <w:tcPr/>
+          <w:p>
+            <w:pPr>
+              <w:pStyle w:val="Compact"/>
+            </w:pPr>
+            <w:r>
+              <w:t xml:space="preserve">Incidencias abiertas (issues)</w:t>
+            </w:r>
+          </w:p>
+        </w:tc>
+        <w:tc>
+          <w:tcPr/>
+          <w:p>
+            <w:pPr>
+              <w:pStyle w:val="Compact"/>
+            </w:pPr>
+            <w:r>
+              <w:t xml:space="preserve">6</w:t>
+            </w:r>
+          </w:p>
+        </w:tc>
+      </w:tr>
+      <w:tr>
+        <w:tc>
+          <w:tcPr/>
+          <w:p>
+            <w:pPr>
+              <w:pStyle w:val="Compact"/>
+            </w:pPr>
+            <w:r>
+              <w:t xml:space="preserve">KLDC estimado</w:t>
+            </w:r>
+          </w:p>
+        </w:tc>
+        <w:tc>
+          <w:tcPr/>
+          <w:p>
+            <w:pPr>
+              <w:pStyle w:val="Compact"/>
+            </w:pPr>
+            <w:r>
+              <w:t xml:space="preserve">25.0</w:t>
+            </w:r>
+          </w:p>
+        </w:tc>
+      </w:tr>
+      <w:tr>
+        <w:tc>
+          <w:tcPr/>
+          <w:p>
+            <w:pPr>
+              <w:pStyle w:val="Compact"/>
+            </w:pPr>
+            <w:r>
+              <w:t xml:space="preserve">Esfuerzo estimado</w:t>
+            </w:r>
+          </w:p>
+        </w:tc>
+        <w:tc>
+          <w:tcPr/>
+          <w:p>
+            <w:pPr>
+              <w:pStyle w:val="Compact"/>
+            </w:pPr>
+            <w:r>
+              <w:t xml:space="preserve">71 personas-mes</w:t>
+            </w:r>
+          </w:p>
+        </w:tc>
+      </w:tr>
+    </w:tbl>
     <w:bookmarkEnd w:id="10"/>
     <w:bookmarkStart w:id="11" w:name="wifisurveyor"/>
     <w:p>
@@ -1422,166 +1549,284 @@
         <w:t xml:space="preserve">lo convierte en una referencia metodológica relevante.</w:t>
       </w:r>
     </w:p>
-    <w:p>
-      <w:r>
-        <w:pict>
-          <v:rect style="width:0;height:1.5pt" o:hralign="center" o:hrstd="t" o:hr="t"/>
-        </w:pict>
-      </w:r>
-    </w:p>
-    <w:p>
-      <w:pPr>
-        <w:pStyle w:val="SourceCode"/>
-      </w:pPr>
-      <w:r>
-        <w:rPr>
-          <w:rStyle w:val="VerbatimChar"/>
-        </w:rPr>
-        <w:t xml:space="preserve">         **Atributo**                          **Valor**</w:t>
-      </w:r>
-    </w:p>
-    <w:p>
-      <w:r>
-        <w:pict>
-          <v:rect style="width:0;height:1.5pt" o:hralign="center" o:hrstd="t" o:hr="t"/>
-        </w:pict>
-      </w:r>
-    </w:p>
-    <w:p>
-      <w:pPr>
-        <w:pStyle w:val="SourceCode"/>
-      </w:pPr>
-      <w:r>
-        <w:rPr>
-          <w:rStyle w:val="VerbatimChar"/>
-        </w:rPr>
-        <w:t xml:space="preserve">          Repositorio               github.com/ecoAPM/WiFiSurveyor</w:t>
-      </w:r>
-      <w:r>
-        <w:br/>
-      </w:r>
-      <w:r>
-        <w:br/>
-      </w:r>
-      <w:r>
-        <w:rPr>
-          <w:rStyle w:val="VerbatimChar"/>
-        </w:rPr>
-        <w:t xml:space="preserve">          Plataforma              Windows / macOS / Linux (web local)</w:t>
-      </w:r>
-      <w:r>
-        <w:br/>
-      </w:r>
-      <w:r>
-        <w:br/>
-      </w:r>
-      <w:r>
-        <w:rPr>
-          <w:rStyle w:val="VerbatimChar"/>
-        </w:rPr>
-        <w:t xml:space="preserve">      Lenguaje principal             TypeScript 51.7 %, C# 30.9 %,</w:t>
-      </w:r>
-      <w:r>
-        <w:br/>
-      </w:r>
-      <w:r>
-        <w:rPr>
-          <w:rStyle w:val="VerbatimChar"/>
-        </w:rPr>
-        <w:t xml:space="preserve">                                             Vue.js 15.5 %</w:t>
-      </w:r>
-      <w:r>
-        <w:br/>
-      </w:r>
-      <w:r>
-        <w:br/>
-      </w:r>
-      <w:r>
-        <w:rPr>
-          <w:rStyle w:val="VerbatimChar"/>
-        </w:rPr>
-        <w:t xml:space="preserve">           Licencia                             GPL-3.0</w:t>
-      </w:r>
-      <w:r>
-        <w:br/>
-      </w:r>
-      <w:r>
-        <w:br/>
-      </w:r>
-      <w:r>
-        <w:rPr>
-          <w:rStyle w:val="VerbatimChar"/>
-        </w:rPr>
-        <w:t xml:space="preserve">       Estrellas GitHub                           68</w:t>
-      </w:r>
-      <w:r>
-        <w:br/>
-      </w:r>
-      <w:r>
-        <w:br/>
-      </w:r>
-      <w:r>
-        <w:rPr>
-          <w:rStyle w:val="VerbatimChar"/>
-        </w:rPr>
-        <w:t xml:space="preserve">         Bifurcaciones                            10</w:t>
-      </w:r>
-      <w:r>
-        <w:br/>
-      </w:r>
-      <w:r>
-        <w:br/>
-      </w:r>
-      <w:r>
-        <w:rPr>
-          <w:rStyle w:val="VerbatimChar"/>
-        </w:rPr>
-        <w:t xml:space="preserve">   Confirmaciones (commits)                       273</w:t>
-      </w:r>
-      <w:r>
-        <w:br/>
-      </w:r>
-      <w:r>
-        <w:br/>
-      </w:r>
-      <w:r>
-        <w:rPr>
-          <w:rStyle w:val="VerbatimChar"/>
-        </w:rPr>
-        <w:t xml:space="preserve"> Incidencias abiertas (issues)                     8</w:t>
-      </w:r>
-      <w:r>
-        <w:br/>
-      </w:r>
-      <w:r>
-        <w:br/>
-      </w:r>
-      <w:r>
-        <w:rPr>
-          <w:rStyle w:val="VerbatimChar"/>
-        </w:rPr>
-        <w:t xml:space="preserve">         KLDC estimado                            8.0</w:t>
-      </w:r>
-      <w:r>
-        <w:br/>
-      </w:r>
-      <w:r>
-        <w:br/>
-      </w:r>
-      <w:r>
-        <w:rPr>
-          <w:rStyle w:val="VerbatimChar"/>
-        </w:rPr>
-        <w:t xml:space="preserve">       Esfuerzo estimado                    23 personas-mes</w:t>
-      </w:r>
-    </w:p>
-    <w:p>
-      <w:r>
-        <w:pict>
-          <v:rect style="width:0;height:1.5pt" o:hralign="center" o:hrstd="t" o:hr="t"/>
-        </w:pict>
-      </w:r>
-    </w:p>
+    <w:tbl>
+      <w:tblPr>
+        <w:tblStyle w:val="Table"/>
+        <w:tblW w:type="auto" w:w="0"/>
+        <w:tblLook w:firstRow="1" w:lastRow="0" w:firstColumn="0" w:lastColumn="0" w:noHBand="0" w:noVBand="0" w:val="0020"/>
+      </w:tblPr>
+      <w:tblGrid>
+        <w:gridCol w:w="3960"/>
+        <w:gridCol w:w="3960"/>
+      </w:tblGrid>
+      <w:tr>
+        <w:trPr>
+          <w:tblHeader w:val="on"/>
+        </w:trPr>
+        <w:tc>
+          <w:tcPr/>
+          <w:p>
+            <w:pPr>
+              <w:pStyle w:val="Compact"/>
+            </w:pPr>
+            <w:r>
+              <w:t xml:space="preserve">Atributo</w:t>
+            </w:r>
+          </w:p>
+        </w:tc>
+        <w:tc>
+          <w:tcPr/>
+          <w:p>
+            <w:pPr>
+              <w:pStyle w:val="Compact"/>
+            </w:pPr>
+            <w:r>
+              <w:t xml:space="preserve">Valor</w:t>
+            </w:r>
+          </w:p>
+        </w:tc>
+      </w:tr>
+      <w:tr>
+        <w:tc>
+          <w:tcPr/>
+          <w:p>
+            <w:pPr>
+              <w:pStyle w:val="Compact"/>
+            </w:pPr>
+            <w:r>
+              <w:t xml:space="preserve">Repositorio</w:t>
+            </w:r>
+          </w:p>
+        </w:tc>
+        <w:tc>
+          <w:tcPr/>
+          <w:p>
+            <w:pPr>
+              <w:pStyle w:val="Compact"/>
+            </w:pPr>
+            <w:r>
+              <w:t xml:space="preserve">github.com/ecoAPM/WiFiSurveyor</w:t>
+            </w:r>
+          </w:p>
+        </w:tc>
+      </w:tr>
+      <w:tr>
+        <w:tc>
+          <w:tcPr/>
+          <w:p>
+            <w:pPr>
+              <w:pStyle w:val="Compact"/>
+            </w:pPr>
+            <w:r>
+              <w:t xml:space="preserve">Plataforma</w:t>
+            </w:r>
+          </w:p>
+        </w:tc>
+        <w:tc>
+          <w:tcPr/>
+          <w:p>
+            <w:pPr>
+              <w:pStyle w:val="Compact"/>
+            </w:pPr>
+            <w:r>
+              <w:t xml:space="preserve">Windows / macOS / Linux (web local)</w:t>
+            </w:r>
+          </w:p>
+        </w:tc>
+      </w:tr>
+      <w:tr>
+        <w:tc>
+          <w:tcPr/>
+          <w:p>
+            <w:pPr>
+              <w:pStyle w:val="Compact"/>
+            </w:pPr>
+            <w:r>
+              <w:t xml:space="preserve">Lenguaje principal</w:t>
+            </w:r>
+          </w:p>
+        </w:tc>
+        <w:tc>
+          <w:tcPr/>
+          <w:p>
+            <w:pPr>
+              <w:pStyle w:val="Compact"/>
+            </w:pPr>
+            <w:r>
+              <w:t xml:space="preserve">TypeScript 51.7 %, C# 30.9 %, Vue.js 15.5 %</w:t>
+            </w:r>
+          </w:p>
+        </w:tc>
+      </w:tr>
+      <w:tr>
+        <w:tc>
+          <w:tcPr/>
+          <w:p>
+            <w:pPr>
+              <w:pStyle w:val="Compact"/>
+            </w:pPr>
+            <w:r>
+              <w:t xml:space="preserve">Licencia</w:t>
+            </w:r>
+          </w:p>
+        </w:tc>
+        <w:tc>
+          <w:tcPr/>
+          <w:p>
+            <w:pPr>
+              <w:pStyle w:val="Compact"/>
+            </w:pPr>
+            <w:r>
+              <w:t xml:space="preserve">GPL-3.0</w:t>
+            </w:r>
+          </w:p>
+        </w:tc>
+      </w:tr>
+      <w:tr>
+        <w:tc>
+          <w:tcPr/>
+          <w:p>
+            <w:pPr>
+              <w:pStyle w:val="Compact"/>
+            </w:pPr>
+            <w:r>
+              <w:t xml:space="preserve">Estrellas GitHub</w:t>
+            </w:r>
+          </w:p>
+        </w:tc>
+        <w:tc>
+          <w:tcPr/>
+          <w:p>
+            <w:pPr>
+              <w:pStyle w:val="Compact"/>
+            </w:pPr>
+            <w:r>
+              <w:t xml:space="preserve">68</w:t>
+            </w:r>
+          </w:p>
+        </w:tc>
+      </w:tr>
+      <w:tr>
+        <w:tc>
+          <w:tcPr/>
+          <w:p>
+            <w:pPr>
+              <w:pStyle w:val="Compact"/>
+            </w:pPr>
+            <w:r>
+              <w:t xml:space="preserve">Bifurcaciones</w:t>
+            </w:r>
+          </w:p>
+        </w:tc>
+        <w:tc>
+          <w:tcPr/>
+          <w:p>
+            <w:pPr>
+              <w:pStyle w:val="Compact"/>
+            </w:pPr>
+            <w:r>
+              <w:t xml:space="preserve">10</w:t>
+            </w:r>
+          </w:p>
+        </w:tc>
+      </w:tr>
+      <w:tr>
+        <w:tc>
+          <w:tcPr/>
+          <w:p>
+            <w:pPr>
+              <w:pStyle w:val="Compact"/>
+            </w:pPr>
+            <w:r>
+              <w:t xml:space="preserve">Confirmaciones (commits)</w:t>
+            </w:r>
+          </w:p>
+        </w:tc>
+        <w:tc>
+          <w:tcPr/>
+          <w:p>
+            <w:pPr>
+              <w:pStyle w:val="Compact"/>
+            </w:pPr>
+            <w:r>
+              <w:t xml:space="preserve">273</w:t>
+            </w:r>
+          </w:p>
+        </w:tc>
+      </w:tr>
+      <w:tr>
+        <w:tc>
+          <w:tcPr/>
+          <w:p>
+            <w:pPr>
+              <w:pStyle w:val="Compact"/>
+            </w:pPr>
+            <w:r>
+              <w:t xml:space="preserve">Incidencias abiertas (issues)</w:t>
+            </w:r>
+          </w:p>
+        </w:tc>
+        <w:tc>
+          <w:tcPr/>
+          <w:p>
+            <w:pPr>
+              <w:pStyle w:val="Compact"/>
+            </w:pPr>
+            <w:r>
+              <w:t xml:space="preserve">8</w:t>
+            </w:r>
+          </w:p>
+        </w:tc>
+      </w:tr>
+      <w:tr>
+        <w:tc>
+          <w:tcPr/>
+          <w:p>
+            <w:pPr>
+              <w:pStyle w:val="Compact"/>
+            </w:pPr>
+            <w:r>
+              <w:t xml:space="preserve">KLDC estimado</w:t>
+            </w:r>
+          </w:p>
+        </w:tc>
+        <w:tc>
+          <w:tcPr/>
+          <w:p>
+            <w:pPr>
+              <w:pStyle w:val="Compact"/>
+            </w:pPr>
+            <w:r>
+              <w:t xml:space="preserve">8.0</w:t>
+            </w:r>
+          </w:p>
+        </w:tc>
+      </w:tr>
+      <w:tr>
+        <w:tc>
+          <w:tcPr/>
+          <w:p>
+            <w:pPr>
+              <w:pStyle w:val="Compact"/>
+            </w:pPr>
+            <w:r>
+              <w:t xml:space="preserve">Esfuerzo estimado</w:t>
+            </w:r>
+          </w:p>
+        </w:tc>
+        <w:tc>
+          <w:tcPr/>
+          <w:p>
+            <w:pPr>
+              <w:pStyle w:val="Compact"/>
+            </w:pPr>
+            <w:r>
+              <w:t xml:space="preserve">23 personas-mes</w:t>
+            </w:r>
+          </w:p>
+        </w:tc>
+      </w:tr>
+    </w:tbl>
     <w:bookmarkEnd w:id="11"/>
     <w:bookmarkStart w:id="12" w:name="python-wifi-survey-heatmap"/>
     <w:p>
@@ -1680,157 +1925,284 @@
         <w:t xml:space="preserve">sobre el plano del edificio.</w:t>
       </w:r>
     </w:p>
-    <w:p>
-      <w:r>
-        <w:pict>
-          <v:rect style="width:0;height:1.5pt" o:hralign="center" o:hrstd="t" o:hr="t"/>
-        </w:pict>
-      </w:r>
-    </w:p>
-    <w:p>
-      <w:pPr>
-        <w:pStyle w:val="SourceCode"/>
-      </w:pPr>
-      <w:r>
-        <w:rPr>
-          <w:rStyle w:val="VerbatimChar"/>
-        </w:rPr>
-        <w:t xml:space="preserve">         **Atributo**                                **Valor**</w:t>
-      </w:r>
-    </w:p>
-    <w:p>
-      <w:r>
-        <w:pict>
-          <v:rect style="width:0;height:1.5pt" o:hralign="center" o:hrstd="t" o:hr="t"/>
-        </w:pict>
-      </w:r>
-    </w:p>
-    <w:p>
-      <w:pPr>
-        <w:pStyle w:val="SourceCode"/>
-      </w:pPr>
-      <w:r>
-        <w:rPr>
-          <w:rStyle w:val="VerbatimChar"/>
-        </w:rPr>
-        <w:t xml:space="preserve">          Repositorio              github.com/jantman/python-wifi-survey-heatmap</w:t>
-      </w:r>
-      <w:r>
-        <w:br/>
-      </w:r>
-      <w:r>
-        <w:br/>
-      </w:r>
-      <w:r>
-        <w:rPr>
-          <w:rStyle w:val="VerbatimChar"/>
-        </w:rPr>
-        <w:t xml:space="preserve">          Plataforma                            Linux (escritorio)</w:t>
-      </w:r>
-      <w:r>
-        <w:br/>
-      </w:r>
-      <w:r>
-        <w:br/>
-      </w:r>
-      <w:r>
-        <w:rPr>
-          <w:rStyle w:val="VerbatimChar"/>
-        </w:rPr>
-        <w:t xml:space="preserve">      Lenguaje principal                           Python 98.3 %</w:t>
-      </w:r>
-      <w:r>
-        <w:br/>
-      </w:r>
-      <w:r>
-        <w:br/>
-      </w:r>
-      <w:r>
-        <w:rPr>
-          <w:rStyle w:val="VerbatimChar"/>
-        </w:rPr>
-        <w:t xml:space="preserve">           Licencia                      No especificada (código abierto)</w:t>
-      </w:r>
-      <w:r>
-        <w:br/>
-      </w:r>
-      <w:r>
-        <w:br/>
-      </w:r>
-      <w:r>
-        <w:rPr>
-          <w:rStyle w:val="VerbatimChar"/>
-        </w:rPr>
-        <w:t xml:space="preserve">       Estrellas GitHub                                 467</w:t>
-      </w:r>
-      <w:r>
-        <w:br/>
-      </w:r>
-      <w:r>
-        <w:br/>
-      </w:r>
-      <w:r>
-        <w:rPr>
-          <w:rStyle w:val="VerbatimChar"/>
-        </w:rPr>
-        <w:t xml:space="preserve">         Bifurcaciones                                  92</w:t>
-      </w:r>
-      <w:r>
-        <w:br/>
-      </w:r>
-      <w:r>
-        <w:br/>
-      </w:r>
-      <w:r>
-        <w:rPr>
-          <w:rStyle w:val="VerbatimChar"/>
-        </w:rPr>
-        <w:t xml:space="preserve">   Confirmaciones (commits)                             141</w:t>
-      </w:r>
-      <w:r>
-        <w:br/>
-      </w:r>
-      <w:r>
-        <w:br/>
-      </w:r>
-      <w:r>
-        <w:rPr>
-          <w:rStyle w:val="VerbatimChar"/>
-        </w:rPr>
-        <w:t xml:space="preserve"> Incidencias abiertas (issues)                           9</w:t>
-      </w:r>
-      <w:r>
-        <w:br/>
-      </w:r>
-      <w:r>
-        <w:br/>
-      </w:r>
-      <w:r>
-        <w:rPr>
-          <w:rStyle w:val="VerbatimChar"/>
-        </w:rPr>
-        <w:t xml:space="preserve">         KLDC estimado                                  2.5</w:t>
-      </w:r>
-      <w:r>
-        <w:br/>
-      </w:r>
-      <w:r>
-        <w:br/>
-      </w:r>
-      <w:r>
-        <w:rPr>
-          <w:rStyle w:val="VerbatimChar"/>
-        </w:rPr>
-        <w:t xml:space="preserve">       Esfuerzo estimado                          7 personas-mes</w:t>
-      </w:r>
-    </w:p>
-    <w:p>
-      <w:r>
-        <w:pict>
-          <v:rect style="width:0;height:1.5pt" o:hralign="center" o:hrstd="t" o:hr="t"/>
-        </w:pict>
-      </w:r>
-    </w:p>
+    <w:tbl>
+      <w:tblPr>
+        <w:tblStyle w:val="Table"/>
+        <w:tblW w:type="auto" w:w="0"/>
+        <w:tblLook w:firstRow="1" w:lastRow="0" w:firstColumn="0" w:lastColumn="0" w:noHBand="0" w:noVBand="0" w:val="0020"/>
+      </w:tblPr>
+      <w:tblGrid>
+        <w:gridCol w:w="3960"/>
+        <w:gridCol w:w="3960"/>
+      </w:tblGrid>
+      <w:tr>
+        <w:trPr>
+          <w:tblHeader w:val="on"/>
+        </w:trPr>
+        <w:tc>
+          <w:tcPr/>
+          <w:p>
+            <w:pPr>
+              <w:pStyle w:val="Compact"/>
+            </w:pPr>
+            <w:r>
+              <w:t xml:space="preserve">Atributo</w:t>
+            </w:r>
+          </w:p>
+        </w:tc>
+        <w:tc>
+          <w:tcPr/>
+          <w:p>
+            <w:pPr>
+              <w:pStyle w:val="Compact"/>
+            </w:pPr>
+            <w:r>
+              <w:t xml:space="preserve">Valor</w:t>
+            </w:r>
+          </w:p>
+        </w:tc>
+      </w:tr>
+      <w:tr>
+        <w:tc>
+          <w:tcPr/>
+          <w:p>
+            <w:pPr>
+              <w:pStyle w:val="Compact"/>
+            </w:pPr>
+            <w:r>
+              <w:t xml:space="preserve">Repositorio</w:t>
+            </w:r>
+          </w:p>
+        </w:tc>
+        <w:tc>
+          <w:tcPr/>
+          <w:p>
+            <w:pPr>
+              <w:pStyle w:val="Compact"/>
+            </w:pPr>
+            <w:r>
+              <w:t xml:space="preserve">github.com/jantman/python-wifi-survey-heatmap</w:t>
+            </w:r>
+          </w:p>
+        </w:tc>
+      </w:tr>
+      <w:tr>
+        <w:tc>
+          <w:tcPr/>
+          <w:p>
+            <w:pPr>
+              <w:pStyle w:val="Compact"/>
+            </w:pPr>
+            <w:r>
+              <w:t xml:space="preserve">Plataforma</w:t>
+            </w:r>
+          </w:p>
+        </w:tc>
+        <w:tc>
+          <w:tcPr/>
+          <w:p>
+            <w:pPr>
+              <w:pStyle w:val="Compact"/>
+            </w:pPr>
+            <w:r>
+              <w:t xml:space="preserve">Linux (escritorio)</w:t>
+            </w:r>
+          </w:p>
+        </w:tc>
+      </w:tr>
+      <w:tr>
+        <w:tc>
+          <w:tcPr/>
+          <w:p>
+            <w:pPr>
+              <w:pStyle w:val="Compact"/>
+            </w:pPr>
+            <w:r>
+              <w:t xml:space="preserve">Lenguaje principal</w:t>
+            </w:r>
+          </w:p>
+        </w:tc>
+        <w:tc>
+          <w:tcPr/>
+          <w:p>
+            <w:pPr>
+              <w:pStyle w:val="Compact"/>
+            </w:pPr>
+            <w:r>
+              <w:t xml:space="preserve">Python 98.3 %</w:t>
+            </w:r>
+          </w:p>
+        </w:tc>
+      </w:tr>
+      <w:tr>
+        <w:tc>
+          <w:tcPr/>
+          <w:p>
+            <w:pPr>
+              <w:pStyle w:val="Compact"/>
+            </w:pPr>
+            <w:r>
+              <w:t xml:space="preserve">Licencia</w:t>
+            </w:r>
+          </w:p>
+        </w:tc>
+        <w:tc>
+          <w:tcPr/>
+          <w:p>
+            <w:pPr>
+              <w:pStyle w:val="Compact"/>
+            </w:pPr>
+            <w:r>
+              <w:t xml:space="preserve">No especificada (código abierto)</w:t>
+            </w:r>
+          </w:p>
+        </w:tc>
+      </w:tr>
+      <w:tr>
+        <w:tc>
+          <w:tcPr/>
+          <w:p>
+            <w:pPr>
+              <w:pStyle w:val="Compact"/>
+            </w:pPr>
+            <w:r>
+              <w:t xml:space="preserve">Estrellas GitHub</w:t>
+            </w:r>
+          </w:p>
+        </w:tc>
+        <w:tc>
+          <w:tcPr/>
+          <w:p>
+            <w:pPr>
+              <w:pStyle w:val="Compact"/>
+            </w:pPr>
+            <w:r>
+              <w:t xml:space="preserve">467</w:t>
+            </w:r>
+          </w:p>
+        </w:tc>
+      </w:tr>
+      <w:tr>
+        <w:tc>
+          <w:tcPr/>
+          <w:p>
+            <w:pPr>
+              <w:pStyle w:val="Compact"/>
+            </w:pPr>
+            <w:r>
+              <w:t xml:space="preserve">Bifurcaciones</w:t>
+            </w:r>
+          </w:p>
+        </w:tc>
+        <w:tc>
+          <w:tcPr/>
+          <w:p>
+            <w:pPr>
+              <w:pStyle w:val="Compact"/>
+            </w:pPr>
+            <w:r>
+              <w:t xml:space="preserve">92</w:t>
+            </w:r>
+          </w:p>
+        </w:tc>
+      </w:tr>
+      <w:tr>
+        <w:tc>
+          <w:tcPr/>
+          <w:p>
+            <w:pPr>
+              <w:pStyle w:val="Compact"/>
+            </w:pPr>
+            <w:r>
+              <w:t xml:space="preserve">Confirmaciones (commits)</w:t>
+            </w:r>
+          </w:p>
+        </w:tc>
+        <w:tc>
+          <w:tcPr/>
+          <w:p>
+            <w:pPr>
+              <w:pStyle w:val="Compact"/>
+            </w:pPr>
+            <w:r>
+              <w:t xml:space="preserve">141</w:t>
+            </w:r>
+          </w:p>
+        </w:tc>
+      </w:tr>
+      <w:tr>
+        <w:tc>
+          <w:tcPr/>
+          <w:p>
+            <w:pPr>
+              <w:pStyle w:val="Compact"/>
+            </w:pPr>
+            <w:r>
+              <w:t xml:space="preserve">Incidencias abiertas (issues)</w:t>
+            </w:r>
+          </w:p>
+        </w:tc>
+        <w:tc>
+          <w:tcPr/>
+          <w:p>
+            <w:pPr>
+              <w:pStyle w:val="Compact"/>
+            </w:pPr>
+            <w:r>
+              <w:t xml:space="preserve">9</w:t>
+            </w:r>
+          </w:p>
+        </w:tc>
+      </w:tr>
+      <w:tr>
+        <w:tc>
+          <w:tcPr/>
+          <w:p>
+            <w:pPr>
+              <w:pStyle w:val="Compact"/>
+            </w:pPr>
+            <w:r>
+              <w:t xml:space="preserve">KLDC estimado</w:t>
+            </w:r>
+          </w:p>
+        </w:tc>
+        <w:tc>
+          <w:tcPr/>
+          <w:p>
+            <w:pPr>
+              <w:pStyle w:val="Compact"/>
+            </w:pPr>
+            <w:r>
+              <w:t xml:space="preserve">2.5</w:t>
+            </w:r>
+          </w:p>
+        </w:tc>
+      </w:tr>
+      <w:tr>
+        <w:tc>
+          <w:tcPr/>
+          <w:p>
+            <w:pPr>
+              <w:pStyle w:val="Compact"/>
+            </w:pPr>
+            <w:r>
+              <w:t xml:space="preserve">Esfuerzo estimado</w:t>
+            </w:r>
+          </w:p>
+        </w:tc>
+        <w:tc>
+          <w:tcPr/>
+          <w:p>
+            <w:pPr>
+              <w:pStyle w:val="Compact"/>
+            </w:pPr>
+            <w:r>
+              <w:t xml:space="preserve">7 personas-mes</w:t>
+            </w:r>
+          </w:p>
+        </w:tc>
+      </w:tr>
+    </w:tbl>
     <w:bookmarkEnd w:id="12"/>
     <w:bookmarkEnd w:id="13"/>
     <w:bookmarkStart w:id="19" w:name="métricas-orientadas-al-tamaño-mot"/>

</xml_diff>